<commit_message>
27.02.2026 - Documentazione e implementazione
</commit_message>
<xml_diff>
--- a/3_Documentazione/Documentazione_gestionale-assenze.docx
+++ b/3_Documentazione/Documentazione_gestionale-assenze.docx
@@ -9171,6 +9171,215 @@
     <w:p/>
     <w:p>
       <w:r>
+        <w:rPr>
+          <w:b/>
+          <w:bCs/>
+        </w:rPr>
+        <w:t>USERS</w:t>
+      </w:r>
+      <w:r>
+        <w:br/>
+        <w:t>Contiene i dati principali degli utenti del sistema, come nome, email, password e riferimento alla classe. È la tabella centrale da cui partono la maggior parte delle relazioni.</w:t>
+      </w:r>
+    </w:p>
+    <w:p>
+      <w:r>
+        <w:rPr>
+          <w:b/>
+          <w:bCs/>
+        </w:rPr>
+        <w:t>ROLES</w:t>
+      </w:r>
+      <w:r>
+        <w:br/>
+        <w:t>Definisce i ruoli presenti nel sistema (ad esempio docente, allievo, tutore, amministratore). Serve per determinare i permessi associati a ciascun utente.</w:t>
+      </w:r>
+    </w:p>
+    <w:p>
+      <w:r>
+        <w:rPr>
+          <w:b/>
+          <w:bCs/>
+        </w:rPr>
+        <w:t>PERMISSIONS</w:t>
+      </w:r>
+      <w:r>
+        <w:br/>
+        <w:t>Contiene l’elenco dei permessi disponibili nel sistema, che stabiliscono quali azioni possono essere eseguite.</w:t>
+      </w:r>
+    </w:p>
+    <w:p>
+      <w:r>
+        <w:rPr>
+          <w:b/>
+          <w:bCs/>
+        </w:rPr>
+        <w:t>ROLE_USER</w:t>
+      </w:r>
+      <w:r>
+        <w:br/>
+        <w:t>Tabella pivot che collega utenti e ruoli, permettendo di assegnare uno o più ruoli a ciascun utente.</w:t>
+      </w:r>
+    </w:p>
+    <w:p>
+      <w:r>
+        <w:rPr>
+          <w:b/>
+          <w:bCs/>
+        </w:rPr>
+        <w:t>PERMISSION_ROLE</w:t>
+      </w:r>
+      <w:r>
+        <w:br/>
+        <w:t>Tabella pivot che collega ruoli e permessi, definendo quali permessi appartengono a ciascun ruolo.</w:t>
+      </w:r>
+    </w:p>
+    <w:p>
+      <w:r>
+        <w:rPr>
+          <w:b/>
+          <w:bCs/>
+        </w:rPr>
+        <w:lastRenderedPageBreak/>
+        <w:t>CLASSROOM</w:t>
+      </w:r>
+      <w:r>
+        <w:br/>
+        <w:t>Rappresenta le classi scolastiche, con informazioni come nome, anno, sezione e periodo.</w:t>
+      </w:r>
+    </w:p>
+    <w:p>
+      <w:r>
+        <w:rPr>
+          <w:b/>
+          <w:bCs/>
+        </w:rPr>
+        <w:t>ABSENCES (ASSENZE)</w:t>
+      </w:r>
+      <w:r>
+        <w:br/>
+        <w:t>Memorizza le assenze degli studenti, indicando data, motivazione, stato di approvazione e riferimenti all’utente che ha inserito o approvato l’assenza.</w:t>
+      </w:r>
+    </w:p>
+    <w:p>
+      <w:r>
+        <w:rPr>
+          <w:b/>
+          <w:bCs/>
+        </w:rPr>
+        <w:t>DELAY (RITARDI)</w:t>
+      </w:r>
+      <w:r>
+        <w:br/>
+        <w:t>Contiene i dati relativi ai ritardi degli studenti, con informazioni su data, durata e stato.</w:t>
+      </w:r>
+    </w:p>
+    <w:p>
+      <w:r>
+        <w:rPr>
+          <w:b/>
+          <w:bCs/>
+        </w:rPr>
+        <w:t>MEDICAL_CERTIFICATE</w:t>
+      </w:r>
+      <w:r>
+        <w:br/>
+        <w:t>Archivia i certificati medici caricati per giustificare le assenze, includendo il percorso del file e l’utente che lo ha validato.</w:t>
+      </w:r>
+    </w:p>
+    <w:p>
+      <w:r>
+        <w:rPr>
+          <w:b/>
+          <w:bCs/>
+        </w:rPr>
+        <w:t>SIGNATURE_CONFIRMATION</w:t>
+      </w:r>
+      <w:r>
+        <w:br/>
+        <w:t>Gestisce la firma digitale o conferma del tutore per la giustificazione delle assenze.</w:t>
+      </w:r>
+    </w:p>
+    <w:p>
+      <w:r>
+        <w:rPr>
+          <w:b/>
+          <w:bCs/>
+        </w:rPr>
+        <w:t>IMPORT_BATCH</w:t>
+      </w:r>
+      <w:r>
+        <w:br/>
+        <w:t>Registra le operazioni di importazione delle classi o degli studenti, salvando informazioni sul file importato e sul risultato dell’operazione.</w:t>
+      </w:r>
+    </w:p>
+    <w:p>
+      <w:r>
+        <w:rPr>
+          <w:b/>
+          <w:bCs/>
+        </w:rPr>
+        <w:t>AUDIT_LOG</w:t>
+      </w:r>
+      <w:r>
+        <w:br/>
+        <w:t>Tiene traccia delle azioni effettuate nel sistema (chi ha fatto cosa e quando), utile per controlli e sicurezza.</w:t>
+      </w:r>
+    </w:p>
+    <w:p>
+      <w:r>
+        <w:rPr>
+          <w:b/>
+          <w:bCs/>
+        </w:rPr>
+        <w:t>CLASSROOM_LOG</w:t>
+      </w:r>
+      <w:r>
+        <w:br/>
+        <w:t>Memorizza le modifiche effettuate sulle classi nel tempo.</w:t>
+      </w:r>
+    </w:p>
+    <w:p>
+      <w:r>
+        <w:rPr>
+          <w:b/>
+          <w:bCs/>
+        </w:rPr>
+        <w:t>DELAY_LOG</w:t>
+      </w:r>
+      <w:r>
+        <w:br/>
+        <w:t>Registra le operazioni relative ai ritardi.</w:t>
+      </w:r>
+    </w:p>
+    <w:p>
+      <w:r>
+        <w:rPr>
+          <w:b/>
+          <w:bCs/>
+        </w:rPr>
+        <w:t>USER_LOG</w:t>
+      </w:r>
+      <w:r>
+        <w:br/>
+        <w:t>Tiene traccia delle modifiche o operazioni effettuate sugli utenti.</w:t>
+      </w:r>
+    </w:p>
+    <w:p>
+      <w:r>
+        <w:rPr>
+          <w:b/>
+          <w:bCs/>
+        </w:rPr>
+        <w:t>ABSENCE_LOG</w:t>
+      </w:r>
+      <w:r>
+        <w:br/>
+        <w:t>Memorizza lo storico delle modifiche relative alle assenze.</w:t>
+      </w:r>
+    </w:p>
+    <w:p>
+      <w:r>
         <w:br w:type="page"/>
       </w:r>
     </w:p>
@@ -9559,15 +9768,177 @@
       <w:bookmarkEnd w:id="24"/>
     </w:p>
     <w:p>
-      <w:pPr>
-        <w:pStyle w:val="Titolo2"/>
-        <w:rPr>
-          <w:lang w:val="it-CH"/>
-        </w:rPr>
-      </w:pPr>
       <w:bookmarkStart w:id="25" w:name="_Toc429059811"/>
       <w:bookmarkStart w:id="26" w:name="_Toc222925011"/>
       <w:r>
+        <w:lastRenderedPageBreak/>
+        <w:t>Il diagramma delle classi rappresenta la struttura logica dell’applicazione e mostra le principali entità del sistema con i loro attributi, metodi e relazioni.</w:t>
+      </w:r>
+    </w:p>
+    <w:p/>
+    <w:p>
+      <w:r>
+        <w:t xml:space="preserve">La classe </w:t>
+      </w:r>
+      <w:r>
+        <w:rPr>
+          <w:b/>
+          <w:bCs/>
+        </w:rPr>
+        <w:t>User</w:t>
+      </w:r>
+      <w:r>
+        <w:t xml:space="preserve"> è centrale nel sistema e contiene le informazioni dell’utente, come nome, email, password, ruolo e classe di appartenenza. Include anche metodi per verificare il tipo di utente (studente, docente, amministratore) e relazioni con assenze, ritardi e log delle attività.</w:t>
+      </w:r>
+    </w:p>
+    <w:p/>
+    <w:p>
+      <w:r>
+        <w:t xml:space="preserve">La classe </w:t>
+      </w:r>
+      <w:proofErr w:type="spellStart"/>
+      <w:r>
+        <w:rPr>
+          <w:b/>
+          <w:bCs/>
+        </w:rPr>
+        <w:t>Classroom</w:t>
+      </w:r>
+      <w:proofErr w:type="spellEnd"/>
+      <w:r>
+        <w:t xml:space="preserve"> rappresenta le classi scolastiche e contiene dati come nome, anno e sezione. È collegata agli studenti, ai docenti e alle assenze associate alla classe.</w:t>
+      </w:r>
+    </w:p>
+    <w:p/>
+    <w:p>
+      <w:r>
+        <w:t xml:space="preserve">La classe </w:t>
+      </w:r>
+      <w:proofErr w:type="spellStart"/>
+      <w:r>
+        <w:rPr>
+          <w:b/>
+          <w:bCs/>
+        </w:rPr>
+        <w:t>Absence</w:t>
+      </w:r>
+      <w:proofErr w:type="spellEnd"/>
+      <w:r>
+        <w:t xml:space="preserve"> gestisce le assenze degli studenti, includendo periodo, motivazione, stato e numero di ore. Contiene metodi per la giustificazione, la verifica della necessità di certificato medico o firma e il collegamento con certificati e firme.</w:t>
+      </w:r>
+    </w:p>
+    <w:p/>
+    <w:p>
+      <w:r>
+        <w:t xml:space="preserve">La classe </w:t>
+      </w:r>
+      <w:r>
+        <w:rPr>
+          <w:b/>
+          <w:bCs/>
+        </w:rPr>
+        <w:t>Delay</w:t>
+      </w:r>
+      <w:r>
+        <w:t xml:space="preserve"> rappresenta i ritardi degli studenti, indicando data, durata in minuti e docente che ha registrato l’evento.</w:t>
+      </w:r>
+    </w:p>
+    <w:p/>
+    <w:p>
+      <w:r>
+        <w:t xml:space="preserve">La classe </w:t>
+      </w:r>
+      <w:proofErr w:type="spellStart"/>
+      <w:r>
+        <w:rPr>
+          <w:b/>
+          <w:bCs/>
+        </w:rPr>
+        <w:t>MedicalCertificate</w:t>
+      </w:r>
+      <w:proofErr w:type="spellEnd"/>
+      <w:r>
+        <w:t xml:space="preserve"> gestisce i certificati medici caricati per giustificare le assenze, con metodi per accettazione, rifiuto e verifica della scadenza.</w:t>
+      </w:r>
+    </w:p>
+    <w:p/>
+    <w:p>
+      <w:r>
+        <w:t xml:space="preserve">La classe </w:t>
+      </w:r>
+      <w:proofErr w:type="spellStart"/>
+      <w:r>
+        <w:rPr>
+          <w:b/>
+          <w:bCs/>
+        </w:rPr>
+        <w:t>SignatureConfirmation</w:t>
+      </w:r>
+      <w:proofErr w:type="spellEnd"/>
+      <w:r>
+        <w:t xml:space="preserve"> si occupa della firma del tutore per la giustificazione dell’assenza, includendo token di verifica e controllo della validità.</w:t>
+      </w:r>
+    </w:p>
+    <w:p/>
+    <w:p>
+      <w:r>
+        <w:t xml:space="preserve">La classe </w:t>
+      </w:r>
+      <w:proofErr w:type="spellStart"/>
+      <w:r>
+        <w:rPr>
+          <w:b/>
+          <w:bCs/>
+        </w:rPr>
+        <w:t>AuditLog</w:t>
+      </w:r>
+      <w:proofErr w:type="spellEnd"/>
+      <w:r>
+        <w:t xml:space="preserve"> registra le azioni effettuate nel sistema, memorizzando chi ha compiuto un’operazione, su quale entità e in quale momento.</w:t>
+      </w:r>
+    </w:p>
+    <w:p/>
+    <w:p>
+      <w:r>
+        <w:t xml:space="preserve">Infine, la classe </w:t>
+      </w:r>
+      <w:proofErr w:type="spellStart"/>
+      <w:r>
+        <w:rPr>
+          <w:b/>
+          <w:bCs/>
+        </w:rPr>
+        <w:t>ImportBatch</w:t>
+      </w:r>
+      <w:proofErr w:type="spellEnd"/>
+      <w:r>
+        <w:t xml:space="preserve"> gestisce le operazioni di importazione dei dati (ad esempio studenti o classi), tracciando file importati, stato dell’operazione e report generati.</w:t>
+      </w:r>
+    </w:p>
+    <w:p/>
+    <w:p>
+      <w:r>
+        <w:t>Nel complesso, il diagramma mostra le relazioni tra le classi e definisce chiaramente le responsabilità di ciascuna componente all’interno dell’applicazione.</w:t>
+      </w:r>
+    </w:p>
+    <w:p>
+      <w:pPr>
+        <w:rPr>
+          <w:b/>
+        </w:rPr>
+      </w:pPr>
+      <w:r>
+        <w:br w:type="page"/>
+      </w:r>
+    </w:p>
+    <w:p>
+      <w:pPr>
+        <w:pStyle w:val="Titolo2"/>
+        <w:rPr>
+          <w:lang w:val="it-CH"/>
+        </w:rPr>
+      </w:pPr>
+      <w:r>
         <w:rPr>
           <w:lang w:val="it-CH"/>
         </w:rPr>
@@ -9592,17 +9963,28 @@
     </w:p>
     <w:p>
       <w:pPr>
-        <w:pStyle w:val="Titolo2"/>
-        <w:rPr>
-          <w:lang w:val="it-CH"/>
+        <w:rPr>
+          <w:b/>
         </w:rPr>
       </w:pPr>
       <w:bookmarkStart w:id="27" w:name="_Toc429059812"/>
       <w:bookmarkStart w:id="28" w:name="_Toc222925012"/>
       <w:r>
+        <w:br w:type="page"/>
+      </w:r>
+    </w:p>
+    <w:p>
+      <w:pPr>
+        <w:pStyle w:val="Titolo2"/>
         <w:rPr>
           <w:lang w:val="it-CH"/>
         </w:rPr>
+      </w:pPr>
+      <w:r>
+        <w:rPr>
+          <w:lang w:val="it-CH"/>
+        </w:rPr>
+        <w:lastRenderedPageBreak/>
         <w:t>Design procedurale</w:t>
       </w:r>
       <w:bookmarkEnd w:id="27"/>
@@ -9634,14 +10016,17 @@
     </w:p>
     <w:p>
       <w:r>
+        <w:rPr>
+          <w:noProof/>
+        </w:rPr>
         <w:drawing>
-          <wp:anchor distT="0" distB="0" distL="114300" distR="114300" simplePos="0" relativeHeight="251662336" behindDoc="1" locked="0" layoutInCell="1" allowOverlap="1" wp14:anchorId="32E30622" wp14:editId="23ADEA0B">
+          <wp:anchor distT="0" distB="0" distL="114300" distR="114300" simplePos="0" relativeHeight="251662336" behindDoc="1" locked="0" layoutInCell="1" allowOverlap="1" wp14:anchorId="32E30622" wp14:editId="65EA4E5E">
             <wp:simplePos x="0" y="0"/>
-            <wp:positionH relativeFrom="column">
-              <wp:posOffset>133985</wp:posOffset>
+            <wp:positionH relativeFrom="margin">
+              <wp:align>right</wp:align>
             </wp:positionH>
             <wp:positionV relativeFrom="paragraph">
-              <wp:posOffset>652780</wp:posOffset>
+              <wp:posOffset>450761</wp:posOffset>
             </wp:positionV>
             <wp:extent cx="5715635" cy="5582920"/>
             <wp:effectExtent l="190500" t="190500" r="189865" b="189230"/>
@@ -9716,26 +10101,120 @@
       </w:r>
     </w:p>
     <w:p>
+      <w:pPr>
+        <w:pStyle w:val="NormaleWeb"/>
+        <w:rPr>
+          <w:rFonts w:ascii="Bahnschrift" w:hAnsi="Bahnschrift"/>
+          <w:sz w:val="26"/>
+          <w:szCs w:val="20"/>
+          <w:lang w:eastAsia="it-IT"/>
+        </w:rPr>
+      </w:pPr>
+      <w:r>
+        <w:rPr>
+          <w:rFonts w:ascii="Bahnschrift" w:hAnsi="Bahnschrift"/>
+          <w:sz w:val="26"/>
+          <w:szCs w:val="20"/>
+          <w:lang w:eastAsia="it-IT"/>
+        </w:rPr>
+        <w:t xml:space="preserve">L’Activity </w:t>
+      </w:r>
+      <w:proofErr w:type="spellStart"/>
+      <w:r>
+        <w:rPr>
+          <w:rFonts w:ascii="Bahnschrift" w:hAnsi="Bahnschrift"/>
+          <w:sz w:val="26"/>
+          <w:szCs w:val="20"/>
+          <w:lang w:eastAsia="it-IT"/>
+        </w:rPr>
+        <w:t>Diagram</w:t>
+      </w:r>
+      <w:proofErr w:type="spellEnd"/>
+      <w:r>
+        <w:rPr>
+          <w:rFonts w:ascii="Bahnschrift" w:hAnsi="Bahnschrift"/>
+          <w:sz w:val="26"/>
+          <w:szCs w:val="20"/>
+          <w:lang w:eastAsia="it-IT"/>
+        </w:rPr>
+        <w:t xml:space="preserve"> rappresenta il flusso operativo della richiesta di congedo (assenza) all’interno del sistema, mostrando le diverse fasi e i soggetti coinvolti: studente, tutore legale, sistema, capolaboratorio e direzione.</w:t>
+      </w:r>
+    </w:p>
+    <w:p>
+      <w:pPr>
+        <w:pStyle w:val="NormaleWeb"/>
+        <w:rPr>
+          <w:rFonts w:ascii="Bahnschrift" w:hAnsi="Bahnschrift"/>
+          <w:sz w:val="26"/>
+          <w:szCs w:val="20"/>
+          <w:lang w:eastAsia="it-IT"/>
+        </w:rPr>
+      </w:pPr>
+      <w:r>
+        <w:rPr>
+          <w:rFonts w:ascii="Bahnschrift" w:hAnsi="Bahnschrift"/>
+          <w:sz w:val="26"/>
+          <w:szCs w:val="20"/>
+          <w:lang w:eastAsia="it-IT"/>
+        </w:rPr>
+        <w:t xml:space="preserve">Il processo inizia con lo studente che inserisce la richiesta di assenza. Il sistema verifica inizialmente se l’assenza inizia entro 24 ore e se lo studente è </w:t>
+      </w:r>
+      <w:r>
+        <w:rPr>
+          <w:rFonts w:ascii="Bahnschrift" w:hAnsi="Bahnschrift"/>
+          <w:sz w:val="26"/>
+          <w:szCs w:val="20"/>
+          <w:lang w:eastAsia="it-IT"/>
+        </w:rPr>
+        <w:lastRenderedPageBreak/>
+        <w:t>maggiorenne. Nel caso di studente minorenne, è necessario il coinvolgimento del tutore legale, che può approvare o rifiutare la richiesta.</w:t>
+      </w:r>
+    </w:p>
+    <w:p>
+      <w:pPr>
+        <w:pStyle w:val="NormaleWeb"/>
+        <w:rPr>
+          <w:rFonts w:ascii="Bahnschrift" w:hAnsi="Bahnschrift"/>
+          <w:sz w:val="26"/>
+          <w:szCs w:val="20"/>
+          <w:lang w:eastAsia="it-IT"/>
+        </w:rPr>
+      </w:pPr>
+      <w:r>
+        <w:rPr>
+          <w:rFonts w:ascii="Bahnschrift" w:hAnsi="Bahnschrift"/>
+          <w:sz w:val="26"/>
+          <w:szCs w:val="20"/>
+          <w:lang w:eastAsia="it-IT"/>
+        </w:rPr>
+        <w:t>Successivamente, il sistema controlla la durata dell’assenza. Se supera un determinato limite (ad esempio più di un giorno), la richiesta viene inoltrata ai livelli superiori, come capolaboratorio e direzione, per un’ulteriore approvazione. In base alle decisioni prese, lo stato dell’assenza viene aggiornato come approvato o respinto.</w:t>
+      </w:r>
+    </w:p>
+    <w:p>
+      <w:pPr>
+        <w:pStyle w:val="NormaleWeb"/>
+        <w:rPr>
+          <w:rFonts w:ascii="Bahnschrift" w:hAnsi="Bahnschrift"/>
+          <w:sz w:val="26"/>
+          <w:szCs w:val="20"/>
+          <w:lang w:eastAsia="it-IT"/>
+        </w:rPr>
+      </w:pPr>
+      <w:r>
+        <w:rPr>
+          <w:rFonts w:ascii="Bahnschrift" w:hAnsi="Bahnschrift"/>
+          <w:sz w:val="26"/>
+          <w:szCs w:val="20"/>
+          <w:lang w:eastAsia="it-IT"/>
+        </w:rPr>
+        <w:t>Infine, il sistema notifica l’esito al richiedente e il processo si conclude. Il diagramma evidenzia quindi il flusso decisionale, i controlli automatici e le responsabilità dei diversi ruoli nel processo di gestione delle richieste di congedo.</w:t>
+      </w:r>
+    </w:p>
+    <w:p>
       <w:r>
         <w:br w:type="page"/>
       </w:r>
-    </w:p>
-    <w:p>
       <w:bookmarkStart w:id="30" w:name="_Toc461179222"/>
-    </w:p>
-    <w:p>
-      <w:pPr>
-        <w:rPr>
-          <w:rFonts w:eastAsiaTheme="majorEastAsia" w:cstheme="majorBidi"/>
-          <w:b/>
-          <w:sz w:val="28"/>
-          <w:szCs w:val="32"/>
-          <w:lang w:eastAsia="en-US"/>
-        </w:rPr>
-      </w:pPr>
-      <w:r>
-        <w:br w:type="page"/>
-      </w:r>
     </w:p>
     <w:p>
       <w:pPr>
@@ -10556,7 +11035,6 @@
           <w:lang w:val="fr-CH" w:eastAsia="it-CH"/>
         </w:rPr>
       </w:pPr>
-      <w:proofErr w:type="gramStart"/>
       <w:r>
         <w:rPr>
           <w:rFonts w:ascii="Consolas" w:hAnsi="Consolas"/>
@@ -10567,7 +11045,6 @@
         </w:rPr>
         <w:t>use</w:t>
       </w:r>
-      <w:proofErr w:type="gramEnd"/>
       <w:r>
         <w:rPr>
           <w:rFonts w:ascii="Consolas" w:hAnsi="Consolas"/>
@@ -10680,7 +11157,6 @@
           <w:lang w:val="fr-CH" w:eastAsia="it-CH"/>
         </w:rPr>
       </w:pPr>
-      <w:proofErr w:type="gramStart"/>
       <w:r>
         <w:rPr>
           <w:rFonts w:ascii="Consolas" w:hAnsi="Consolas"/>
@@ -10701,7 +11177,6 @@
         </w:rPr>
         <w:t>::</w:t>
       </w:r>
-      <w:proofErr w:type="gramEnd"/>
       <w:r>
         <w:rPr>
           <w:rFonts w:ascii="Consolas" w:hAnsi="Consolas"/>
@@ -10846,7 +11321,6 @@
         <w:t xml:space="preserve">    </w:t>
       </w:r>
       <w:proofErr w:type="spellStart"/>
-      <w:proofErr w:type="gramStart"/>
       <w:r>
         <w:rPr>
           <w:rFonts w:ascii="Consolas" w:hAnsi="Consolas"/>
@@ -10869,7 +11343,6 @@
         <w:t>::</w:t>
       </w:r>
       <w:proofErr w:type="spellStart"/>
-      <w:proofErr w:type="gramEnd"/>
       <w:r>
         <w:rPr>
           <w:rFonts w:ascii="Consolas" w:hAnsi="Consolas"/>
@@ -11145,7 +11618,6 @@
         <w:t xml:space="preserve">    </w:t>
       </w:r>
       <w:proofErr w:type="spellStart"/>
-      <w:proofErr w:type="gramStart"/>
       <w:r>
         <w:rPr>
           <w:rFonts w:ascii="Consolas" w:hAnsi="Consolas"/>
@@ -11167,7 +11639,6 @@
         </w:rPr>
         <w:t>::</w:t>
       </w:r>
-      <w:proofErr w:type="gramEnd"/>
       <w:r>
         <w:rPr>
           <w:rFonts w:ascii="Consolas" w:hAnsi="Consolas"/>
@@ -11341,7 +11812,6 @@
         <w:t xml:space="preserve">    </w:t>
       </w:r>
       <w:proofErr w:type="spellStart"/>
-      <w:proofErr w:type="gramStart"/>
       <w:r>
         <w:rPr>
           <w:rFonts w:ascii="Consolas" w:hAnsi="Consolas"/>
@@ -11364,7 +11834,6 @@
         <w:t>::</w:t>
       </w:r>
       <w:proofErr w:type="spellStart"/>
-      <w:proofErr w:type="gramEnd"/>
       <w:r>
         <w:rPr>
           <w:rFonts w:ascii="Consolas" w:hAnsi="Consolas"/>
@@ -11596,7 +12065,6 @@
         <w:t xml:space="preserve">    </w:t>
       </w:r>
       <w:proofErr w:type="spellStart"/>
-      <w:proofErr w:type="gramStart"/>
       <w:r>
         <w:rPr>
           <w:rFonts w:ascii="Consolas" w:hAnsi="Consolas"/>
@@ -11618,7 +12086,6 @@
         </w:rPr>
         <w:t>::</w:t>
       </w:r>
-      <w:proofErr w:type="gramEnd"/>
       <w:r>
         <w:rPr>
           <w:rFonts w:ascii="Consolas" w:hAnsi="Consolas"/>
@@ -11770,7 +12237,6 @@
         <w:t xml:space="preserve">    </w:t>
       </w:r>
       <w:proofErr w:type="spellStart"/>
-      <w:proofErr w:type="gramStart"/>
       <w:r>
         <w:rPr>
           <w:rFonts w:ascii="Consolas" w:hAnsi="Consolas"/>
@@ -11793,7 +12259,6 @@
         <w:t>::</w:t>
       </w:r>
       <w:proofErr w:type="spellStart"/>
-      <w:proofErr w:type="gramEnd"/>
       <w:r>
         <w:rPr>
           <w:rFonts w:ascii="Consolas" w:hAnsi="Consolas"/>
@@ -11989,7 +12454,6 @@
         <w:t>'</w:t>
       </w:r>
       <w:proofErr w:type="spellStart"/>
-      <w:proofErr w:type="gramStart"/>
       <w:r>
         <w:rPr>
           <w:rFonts w:ascii="Consolas" w:hAnsi="Consolas"/>
@@ -12001,7 +12465,6 @@
         <w:t>password.request</w:t>
       </w:r>
       <w:proofErr w:type="spellEnd"/>
-      <w:proofErr w:type="gramEnd"/>
       <w:r>
         <w:rPr>
           <w:rFonts w:ascii="Consolas" w:hAnsi="Consolas"/>
@@ -12071,7 +12534,6 @@
         <w:t xml:space="preserve">    </w:t>
       </w:r>
       <w:proofErr w:type="spellStart"/>
-      <w:proofErr w:type="gramStart"/>
       <w:r>
         <w:rPr>
           <w:rFonts w:ascii="Consolas" w:hAnsi="Consolas"/>
@@ -12093,7 +12555,6 @@
         </w:rPr>
         <w:t>::</w:t>
       </w:r>
-      <w:proofErr w:type="gramEnd"/>
       <w:r>
         <w:rPr>
           <w:rFonts w:ascii="Consolas" w:hAnsi="Consolas"/>
@@ -12288,7 +12749,6 @@
         <w:t>'</w:t>
       </w:r>
       <w:proofErr w:type="spellStart"/>
-      <w:proofErr w:type="gramStart"/>
       <w:r>
         <w:rPr>
           <w:rFonts w:ascii="Consolas" w:hAnsi="Consolas"/>
@@ -12300,7 +12760,6 @@
         <w:t>password.email</w:t>
       </w:r>
       <w:proofErr w:type="spellEnd"/>
-      <w:proofErr w:type="gramEnd"/>
       <w:r>
         <w:rPr>
           <w:rFonts w:ascii="Consolas" w:hAnsi="Consolas"/>
@@ -12370,7 +12829,6 @@
         <w:t xml:space="preserve">    </w:t>
       </w:r>
       <w:proofErr w:type="spellStart"/>
-      <w:proofErr w:type="gramStart"/>
       <w:r>
         <w:rPr>
           <w:rFonts w:ascii="Consolas" w:hAnsi="Consolas"/>
@@ -12393,7 +12851,6 @@
         <w:t>::</w:t>
       </w:r>
       <w:proofErr w:type="spellStart"/>
-      <w:proofErr w:type="gramEnd"/>
       <w:r>
         <w:rPr>
           <w:rFonts w:ascii="Consolas" w:hAnsi="Consolas"/>
@@ -12567,7 +13024,6 @@
         <w:t>'</w:t>
       </w:r>
       <w:proofErr w:type="spellStart"/>
-      <w:proofErr w:type="gramStart"/>
       <w:r>
         <w:rPr>
           <w:rFonts w:ascii="Consolas" w:hAnsi="Consolas"/>
@@ -12579,7 +13035,6 @@
         <w:t>password.reset</w:t>
       </w:r>
       <w:proofErr w:type="spellEnd"/>
-      <w:proofErr w:type="gramEnd"/>
       <w:r>
         <w:rPr>
           <w:rFonts w:ascii="Consolas" w:hAnsi="Consolas"/>
@@ -12649,7 +13104,6 @@
         <w:t xml:space="preserve">    </w:t>
       </w:r>
       <w:proofErr w:type="spellStart"/>
-      <w:proofErr w:type="gramStart"/>
       <w:r>
         <w:rPr>
           <w:rFonts w:ascii="Consolas" w:hAnsi="Consolas"/>
@@ -12671,7 +13125,6 @@
         </w:rPr>
         <w:t>::</w:t>
       </w:r>
-      <w:proofErr w:type="gramEnd"/>
       <w:r>
         <w:rPr>
           <w:rFonts w:ascii="Consolas" w:hAnsi="Consolas"/>
@@ -12844,7 +13297,6 @@
         <w:t>'</w:t>
       </w:r>
       <w:proofErr w:type="spellStart"/>
-      <w:proofErr w:type="gramStart"/>
       <w:r>
         <w:rPr>
           <w:rFonts w:ascii="Consolas" w:hAnsi="Consolas"/>
@@ -12856,7 +13308,6 @@
         <w:t>password.store</w:t>
       </w:r>
       <w:proofErr w:type="spellEnd"/>
-      <w:proofErr w:type="gramEnd"/>
       <w:r>
         <w:rPr>
           <w:rFonts w:ascii="Consolas" w:hAnsi="Consolas"/>
@@ -12941,38 +13392,38 @@
           <w:color w:val="202020"/>
           <w:sz w:val="21"/>
           <w:szCs w:val="21"/>
-          <w:lang w:val="fr-CH" w:eastAsia="it-CH"/>
-        </w:rPr>
-      </w:pPr>
-      <w:proofErr w:type="gramStart"/>
+          <w:lang w:eastAsia="it-CH"/>
+        </w:rPr>
+      </w:pPr>
+      <w:proofErr w:type="spellStart"/>
       <w:r>
         <w:rPr>
           <w:rFonts w:ascii="Consolas" w:hAnsi="Consolas"/>
           <w:color w:val="46969A"/>
           <w:sz w:val="21"/>
           <w:szCs w:val="21"/>
-          <w:lang w:val="fr-CH" w:eastAsia="it-CH"/>
+          <w:lang w:eastAsia="it-CH"/>
         </w:rPr>
         <w:t>Route</w:t>
       </w:r>
+      <w:proofErr w:type="spellEnd"/>
       <w:r>
         <w:rPr>
           <w:rFonts w:ascii="Consolas" w:hAnsi="Consolas"/>
           <w:color w:val="573F35"/>
           <w:sz w:val="21"/>
           <w:szCs w:val="21"/>
-          <w:lang w:val="fr-CH" w:eastAsia="it-CH"/>
+          <w:lang w:eastAsia="it-CH"/>
         </w:rPr>
         <w:t>::</w:t>
       </w:r>
-      <w:proofErr w:type="gramEnd"/>
       <w:r>
         <w:rPr>
           <w:rFonts w:ascii="Consolas" w:hAnsi="Consolas"/>
           <w:color w:val="98863B"/>
           <w:sz w:val="21"/>
           <w:szCs w:val="21"/>
-          <w:lang w:val="fr-CH" w:eastAsia="it-CH"/>
+          <w:lang w:eastAsia="it-CH"/>
         </w:rPr>
         <w:t>middleware</w:t>
       </w:r>
@@ -12982,7 +13433,7 @@
           <w:color w:val="202020"/>
           <w:sz w:val="21"/>
           <w:szCs w:val="21"/>
-          <w:lang w:val="fr-CH" w:eastAsia="it-CH"/>
+          <w:lang w:eastAsia="it-CH"/>
         </w:rPr>
         <w:t>(</w:t>
       </w:r>
@@ -12992,7 +13443,7 @@
           <w:color w:val="B86855"/>
           <w:sz w:val="21"/>
           <w:szCs w:val="21"/>
-          <w:lang w:val="fr-CH" w:eastAsia="it-CH"/>
+          <w:lang w:eastAsia="it-CH"/>
         </w:rPr>
         <w:t>'</w:t>
       </w:r>
@@ -13003,7 +13454,7 @@
           <w:color w:val="B86855"/>
           <w:sz w:val="21"/>
           <w:szCs w:val="21"/>
-          <w:lang w:val="fr-CH" w:eastAsia="it-CH"/>
+          <w:lang w:eastAsia="it-CH"/>
         </w:rPr>
         <w:t>auth</w:t>
       </w:r>
@@ -13014,7 +13465,7 @@
           <w:color w:val="B86855"/>
           <w:sz w:val="21"/>
           <w:szCs w:val="21"/>
-          <w:lang w:val="fr-CH" w:eastAsia="it-CH"/>
+          <w:lang w:eastAsia="it-CH"/>
         </w:rPr>
         <w:t>'</w:t>
       </w:r>
@@ -13024,7 +13475,7 @@
           <w:color w:val="202020"/>
           <w:sz w:val="21"/>
           <w:szCs w:val="21"/>
-          <w:lang w:val="fr-CH" w:eastAsia="it-CH"/>
+          <w:lang w:eastAsia="it-CH"/>
         </w:rPr>
         <w:t>)</w:t>
       </w:r>
@@ -13034,7 +13485,7 @@
           <w:color w:val="573F35"/>
           <w:sz w:val="21"/>
           <w:szCs w:val="21"/>
-          <w:lang w:val="fr-CH" w:eastAsia="it-CH"/>
+          <w:lang w:eastAsia="it-CH"/>
         </w:rPr>
         <w:t>-&gt;</w:t>
       </w:r>
@@ -13044,7 +13495,7 @@
           <w:color w:val="98863B"/>
           <w:sz w:val="21"/>
           <w:szCs w:val="21"/>
-          <w:lang w:val="fr-CH" w:eastAsia="it-CH"/>
+          <w:lang w:eastAsia="it-CH"/>
         </w:rPr>
         <w:t>group</w:t>
       </w:r>
@@ -13054,7 +13505,7 @@
           <w:color w:val="202020"/>
           <w:sz w:val="21"/>
           <w:szCs w:val="21"/>
-          <w:lang w:val="fr-CH" w:eastAsia="it-CH"/>
+          <w:lang w:eastAsia="it-CH"/>
         </w:rPr>
         <w:t>(</w:t>
       </w:r>
@@ -13065,7 +13516,7 @@
           <w:color w:val="5460C1"/>
           <w:sz w:val="21"/>
           <w:szCs w:val="21"/>
-          <w:lang w:val="fr-CH" w:eastAsia="it-CH"/>
+          <w:lang w:eastAsia="it-CH"/>
         </w:rPr>
         <w:t>function</w:t>
       </w:r>
@@ -13076,7 +13527,7 @@
           <w:color w:val="202020"/>
           <w:sz w:val="21"/>
           <w:szCs w:val="21"/>
-          <w:lang w:val="fr-CH" w:eastAsia="it-CH"/>
+          <w:lang w:eastAsia="it-CH"/>
         </w:rPr>
         <w:t xml:space="preserve"> () {</w:t>
       </w:r>
@@ -13096,49 +13547,49 @@
           <w:color w:val="202020"/>
           <w:sz w:val="21"/>
           <w:szCs w:val="21"/>
-          <w:lang w:val="fr-CH" w:eastAsia="it-CH"/>
-        </w:rPr>
-      </w:pPr>
-      <w:r>
-        <w:rPr>
-          <w:rFonts w:ascii="Consolas" w:hAnsi="Consolas"/>
-          <w:color w:val="202020"/>
-          <w:sz w:val="21"/>
-          <w:szCs w:val="21"/>
-          <w:lang w:val="fr-CH" w:eastAsia="it-CH"/>
+          <w:lang w:eastAsia="it-CH"/>
+        </w:rPr>
+      </w:pPr>
+      <w:r>
+        <w:rPr>
+          <w:rFonts w:ascii="Consolas" w:hAnsi="Consolas"/>
+          <w:color w:val="202020"/>
+          <w:sz w:val="21"/>
+          <w:szCs w:val="21"/>
+          <w:lang w:eastAsia="it-CH"/>
         </w:rPr>
         <w:t xml:space="preserve">    </w:t>
       </w:r>
-      <w:proofErr w:type="gramStart"/>
+      <w:proofErr w:type="spellStart"/>
       <w:r>
         <w:rPr>
           <w:rFonts w:ascii="Consolas" w:hAnsi="Consolas"/>
           <w:color w:val="46969A"/>
           <w:sz w:val="21"/>
           <w:szCs w:val="21"/>
-          <w:lang w:val="fr-CH" w:eastAsia="it-CH"/>
+          <w:lang w:eastAsia="it-CH"/>
         </w:rPr>
         <w:t>Route</w:t>
       </w:r>
+      <w:proofErr w:type="spellEnd"/>
       <w:r>
         <w:rPr>
           <w:rFonts w:ascii="Consolas" w:hAnsi="Consolas"/>
           <w:color w:val="573F35"/>
           <w:sz w:val="21"/>
           <w:szCs w:val="21"/>
-          <w:lang w:val="fr-CH" w:eastAsia="it-CH"/>
+          <w:lang w:eastAsia="it-CH"/>
         </w:rPr>
         <w:t>::</w:t>
       </w:r>
       <w:proofErr w:type="spellStart"/>
-      <w:proofErr w:type="gramEnd"/>
       <w:r>
         <w:rPr>
           <w:rFonts w:ascii="Consolas" w:hAnsi="Consolas"/>
           <w:color w:val="98863B"/>
           <w:sz w:val="21"/>
           <w:szCs w:val="21"/>
-          <w:lang w:val="fr-CH" w:eastAsia="it-CH"/>
+          <w:lang w:eastAsia="it-CH"/>
         </w:rPr>
         <w:t>get</w:t>
       </w:r>
@@ -13149,7 +13600,7 @@
           <w:color w:val="202020"/>
           <w:sz w:val="21"/>
           <w:szCs w:val="21"/>
-          <w:lang w:val="fr-CH" w:eastAsia="it-CH"/>
+          <w:lang w:eastAsia="it-CH"/>
         </w:rPr>
         <w:t>(</w:t>
       </w:r>
@@ -13159,7 +13610,7 @@
           <w:color w:val="B86855"/>
           <w:sz w:val="21"/>
           <w:szCs w:val="21"/>
-          <w:lang w:val="fr-CH" w:eastAsia="it-CH"/>
+          <w:lang w:eastAsia="it-CH"/>
         </w:rPr>
         <w:t>'</w:t>
       </w:r>
@@ -13170,7 +13621,7 @@
           <w:color w:val="B86855"/>
           <w:sz w:val="21"/>
           <w:szCs w:val="21"/>
-          <w:lang w:val="fr-CH" w:eastAsia="it-CH"/>
+          <w:lang w:eastAsia="it-CH"/>
         </w:rPr>
         <w:t>verify</w:t>
       </w:r>
@@ -13181,7 +13632,7 @@
           <w:color w:val="B86855"/>
           <w:sz w:val="21"/>
           <w:szCs w:val="21"/>
-          <w:lang w:val="fr-CH" w:eastAsia="it-CH"/>
+          <w:lang w:eastAsia="it-CH"/>
         </w:rPr>
         <w:t>-email'</w:t>
       </w:r>
@@ -13191,7 +13642,7 @@
           <w:color w:val="202020"/>
           <w:sz w:val="21"/>
           <w:szCs w:val="21"/>
-          <w:lang w:val="fr-CH" w:eastAsia="it-CH"/>
+          <w:lang w:eastAsia="it-CH"/>
         </w:rPr>
         <w:t xml:space="preserve">, </w:t>
       </w:r>
@@ -13202,7 +13653,7 @@
           <w:color w:val="46969A"/>
           <w:sz w:val="21"/>
           <w:szCs w:val="21"/>
-          <w:lang w:val="fr-CH" w:eastAsia="it-CH"/>
+          <w:lang w:eastAsia="it-CH"/>
         </w:rPr>
         <w:t>EmailVerificationPromptController</w:t>
       </w:r>
@@ -13213,7 +13664,7 @@
           <w:color w:val="573F35"/>
           <w:sz w:val="21"/>
           <w:szCs w:val="21"/>
-          <w:lang w:val="fr-CH" w:eastAsia="it-CH"/>
+          <w:lang w:eastAsia="it-CH"/>
         </w:rPr>
         <w:t>::</w:t>
       </w:r>
@@ -13223,7 +13674,7 @@
           <w:color w:val="5460C1"/>
           <w:sz w:val="21"/>
           <w:szCs w:val="21"/>
-          <w:lang w:val="fr-CH" w:eastAsia="it-CH"/>
+          <w:lang w:eastAsia="it-CH"/>
         </w:rPr>
         <w:t>class</w:t>
       </w:r>
@@ -13233,7 +13684,7 @@
           <w:color w:val="202020"/>
           <w:sz w:val="21"/>
           <w:szCs w:val="21"/>
-          <w:lang w:val="fr-CH" w:eastAsia="it-CH"/>
+          <w:lang w:eastAsia="it-CH"/>
         </w:rPr>
         <w:t>)</w:t>
       </w:r>
@@ -13253,16 +13704,16 @@
           <w:color w:val="202020"/>
           <w:sz w:val="21"/>
           <w:szCs w:val="21"/>
-          <w:lang w:val="fr-CH" w:eastAsia="it-CH"/>
-        </w:rPr>
-      </w:pPr>
-      <w:r>
-        <w:rPr>
-          <w:rFonts w:ascii="Consolas" w:hAnsi="Consolas"/>
-          <w:color w:val="202020"/>
-          <w:sz w:val="21"/>
-          <w:szCs w:val="21"/>
-          <w:lang w:val="fr-CH" w:eastAsia="it-CH"/>
+          <w:lang w:eastAsia="it-CH"/>
+        </w:rPr>
+      </w:pPr>
+      <w:r>
+        <w:rPr>
+          <w:rFonts w:ascii="Consolas" w:hAnsi="Consolas"/>
+          <w:color w:val="202020"/>
+          <w:sz w:val="21"/>
+          <w:szCs w:val="21"/>
+          <w:lang w:eastAsia="it-CH"/>
         </w:rPr>
         <w:lastRenderedPageBreak/>
         <w:t xml:space="preserve">        </w:t>
@@ -13273,73 +13724,69 @@
           <w:color w:val="573F35"/>
           <w:sz w:val="21"/>
           <w:szCs w:val="21"/>
-          <w:lang w:val="fr-CH" w:eastAsia="it-CH"/>
+          <w:lang w:eastAsia="it-CH"/>
         </w:rPr>
         <w:t>-&gt;</w:t>
       </w:r>
+      <w:r>
+        <w:rPr>
+          <w:rFonts w:ascii="Consolas" w:hAnsi="Consolas"/>
+          <w:color w:val="98863B"/>
+          <w:sz w:val="21"/>
+          <w:szCs w:val="21"/>
+          <w:lang w:eastAsia="it-CH"/>
+        </w:rPr>
+        <w:t>name</w:t>
+      </w:r>
+      <w:r>
+        <w:rPr>
+          <w:rFonts w:ascii="Consolas" w:hAnsi="Consolas"/>
+          <w:color w:val="202020"/>
+          <w:sz w:val="21"/>
+          <w:szCs w:val="21"/>
+          <w:lang w:eastAsia="it-CH"/>
+        </w:rPr>
+        <w:t>(</w:t>
+      </w:r>
+      <w:r>
+        <w:rPr>
+          <w:rFonts w:ascii="Consolas" w:hAnsi="Consolas"/>
+          <w:color w:val="B86855"/>
+          <w:sz w:val="21"/>
+          <w:szCs w:val="21"/>
+          <w:lang w:eastAsia="it-CH"/>
+        </w:rPr>
+        <w:t>'</w:t>
+      </w:r>
       <w:proofErr w:type="spellStart"/>
       <w:r>
         <w:rPr>
           <w:rFonts w:ascii="Consolas" w:hAnsi="Consolas"/>
-          <w:color w:val="98863B"/>
-          <w:sz w:val="21"/>
-          <w:szCs w:val="21"/>
-          <w:lang w:val="fr-CH" w:eastAsia="it-CH"/>
-        </w:rPr>
-        <w:t>name</w:t>
+          <w:color w:val="B86855"/>
+          <w:sz w:val="21"/>
+          <w:szCs w:val="21"/>
+          <w:lang w:eastAsia="it-CH"/>
+        </w:rPr>
+        <w:t>verification.notice</w:t>
       </w:r>
       <w:proofErr w:type="spellEnd"/>
       <w:r>
         <w:rPr>
           <w:rFonts w:ascii="Consolas" w:hAnsi="Consolas"/>
-          <w:color w:val="202020"/>
-          <w:sz w:val="21"/>
-          <w:szCs w:val="21"/>
-          <w:lang w:val="fr-CH" w:eastAsia="it-CH"/>
-        </w:rPr>
-        <w:t>(</w:t>
-      </w:r>
-      <w:r>
-        <w:rPr>
-          <w:rFonts w:ascii="Consolas" w:hAnsi="Consolas"/>
           <w:color w:val="B86855"/>
           <w:sz w:val="21"/>
           <w:szCs w:val="21"/>
-          <w:lang w:val="fr-CH" w:eastAsia="it-CH"/>
+          <w:lang w:eastAsia="it-CH"/>
         </w:rPr>
         <w:t>'</w:t>
       </w:r>
-      <w:proofErr w:type="spellStart"/>
-      <w:proofErr w:type="gramStart"/>
-      <w:r>
-        <w:rPr>
-          <w:rFonts w:ascii="Consolas" w:hAnsi="Consolas"/>
-          <w:color w:val="B86855"/>
-          <w:sz w:val="21"/>
-          <w:szCs w:val="21"/>
-          <w:lang w:val="fr-CH" w:eastAsia="it-CH"/>
-        </w:rPr>
-        <w:t>verification.notice</w:t>
-      </w:r>
-      <w:proofErr w:type="spellEnd"/>
-      <w:proofErr w:type="gramEnd"/>
-      <w:r>
-        <w:rPr>
-          <w:rFonts w:ascii="Consolas" w:hAnsi="Consolas"/>
-          <w:color w:val="B86855"/>
-          <w:sz w:val="21"/>
-          <w:szCs w:val="21"/>
-          <w:lang w:val="fr-CH" w:eastAsia="it-CH"/>
-        </w:rPr>
-        <w:t>'</w:t>
-      </w:r>
-      <w:r>
-        <w:rPr>
-          <w:rFonts w:ascii="Consolas" w:hAnsi="Consolas"/>
-          <w:color w:val="202020"/>
-          <w:sz w:val="21"/>
-          <w:szCs w:val="21"/>
-          <w:lang w:val="fr-CH" w:eastAsia="it-CH"/>
+      <w:r>
+        <w:rPr>
+          <w:rFonts w:ascii="Consolas" w:hAnsi="Consolas"/>
+          <w:color w:val="202020"/>
+          <w:sz w:val="21"/>
+          <w:szCs w:val="21"/>
+          <w:lang w:eastAsia="it-CH"/>
         </w:rPr>
         <w:t>);</w:t>
       </w:r>
@@ -13359,7 +13806,7 @@
           <w:color w:val="202020"/>
           <w:sz w:val="21"/>
           <w:szCs w:val="21"/>
-          <w:lang w:val="fr-CH" w:eastAsia="it-CH"/>
+          <w:lang w:eastAsia="it-CH"/>
         </w:rPr>
       </w:pPr>
     </w:p>
@@ -13378,49 +13825,49 @@
           <w:color w:val="202020"/>
           <w:sz w:val="21"/>
           <w:szCs w:val="21"/>
-          <w:lang w:val="fr-CH" w:eastAsia="it-CH"/>
-        </w:rPr>
-      </w:pPr>
-      <w:r>
-        <w:rPr>
-          <w:rFonts w:ascii="Consolas" w:hAnsi="Consolas"/>
-          <w:color w:val="202020"/>
-          <w:sz w:val="21"/>
-          <w:szCs w:val="21"/>
-          <w:lang w:val="fr-CH" w:eastAsia="it-CH"/>
+          <w:lang w:eastAsia="it-CH"/>
+        </w:rPr>
+      </w:pPr>
+      <w:r>
+        <w:rPr>
+          <w:rFonts w:ascii="Consolas" w:hAnsi="Consolas"/>
+          <w:color w:val="202020"/>
+          <w:sz w:val="21"/>
+          <w:szCs w:val="21"/>
+          <w:lang w:eastAsia="it-CH"/>
         </w:rPr>
         <w:t xml:space="preserve">    </w:t>
       </w:r>
-      <w:proofErr w:type="gramStart"/>
+      <w:proofErr w:type="spellStart"/>
       <w:r>
         <w:rPr>
           <w:rFonts w:ascii="Consolas" w:hAnsi="Consolas"/>
           <w:color w:val="46969A"/>
           <w:sz w:val="21"/>
           <w:szCs w:val="21"/>
-          <w:lang w:val="fr-CH" w:eastAsia="it-CH"/>
+          <w:lang w:eastAsia="it-CH"/>
         </w:rPr>
         <w:t>Route</w:t>
       </w:r>
+      <w:proofErr w:type="spellEnd"/>
       <w:r>
         <w:rPr>
           <w:rFonts w:ascii="Consolas" w:hAnsi="Consolas"/>
           <w:color w:val="573F35"/>
           <w:sz w:val="21"/>
           <w:szCs w:val="21"/>
-          <w:lang w:val="fr-CH" w:eastAsia="it-CH"/>
+          <w:lang w:eastAsia="it-CH"/>
         </w:rPr>
         <w:t>::</w:t>
       </w:r>
       <w:proofErr w:type="spellStart"/>
-      <w:proofErr w:type="gramEnd"/>
       <w:r>
         <w:rPr>
           <w:rFonts w:ascii="Consolas" w:hAnsi="Consolas"/>
           <w:color w:val="98863B"/>
           <w:sz w:val="21"/>
           <w:szCs w:val="21"/>
-          <w:lang w:val="fr-CH" w:eastAsia="it-CH"/>
+          <w:lang w:eastAsia="it-CH"/>
         </w:rPr>
         <w:t>get</w:t>
       </w:r>
@@ -13431,7 +13878,7 @@
           <w:color w:val="202020"/>
           <w:sz w:val="21"/>
           <w:szCs w:val="21"/>
-          <w:lang w:val="fr-CH" w:eastAsia="it-CH"/>
+          <w:lang w:eastAsia="it-CH"/>
         </w:rPr>
         <w:t>(</w:t>
       </w:r>
@@ -13441,7 +13888,7 @@
           <w:color w:val="B86855"/>
           <w:sz w:val="21"/>
           <w:szCs w:val="21"/>
-          <w:lang w:val="fr-CH" w:eastAsia="it-CH"/>
+          <w:lang w:eastAsia="it-CH"/>
         </w:rPr>
         <w:t>'</w:t>
       </w:r>
@@ -13452,7 +13899,7 @@
           <w:color w:val="B86855"/>
           <w:sz w:val="21"/>
           <w:szCs w:val="21"/>
-          <w:lang w:val="fr-CH" w:eastAsia="it-CH"/>
+          <w:lang w:eastAsia="it-CH"/>
         </w:rPr>
         <w:t>verify</w:t>
       </w:r>
@@ -13463,17 +13910,39 @@
           <w:color w:val="B86855"/>
           <w:sz w:val="21"/>
           <w:szCs w:val="21"/>
-          <w:lang w:val="fr-CH" w:eastAsia="it-CH"/>
-        </w:rPr>
-        <w:t>-email/{id}/{hash}'</w:t>
-      </w:r>
-      <w:r>
-        <w:rPr>
-          <w:rFonts w:ascii="Consolas" w:hAnsi="Consolas"/>
-          <w:color w:val="202020"/>
-          <w:sz w:val="21"/>
-          <w:szCs w:val="21"/>
-          <w:lang w:val="fr-CH" w:eastAsia="it-CH"/>
+          <w:lang w:eastAsia="it-CH"/>
+        </w:rPr>
+        <w:t>-email/{id}/{</w:t>
+      </w:r>
+      <w:proofErr w:type="spellStart"/>
+      <w:r>
+        <w:rPr>
+          <w:rFonts w:ascii="Consolas" w:hAnsi="Consolas"/>
+          <w:color w:val="B86855"/>
+          <w:sz w:val="21"/>
+          <w:szCs w:val="21"/>
+          <w:lang w:eastAsia="it-CH"/>
+        </w:rPr>
+        <w:t>hash</w:t>
+      </w:r>
+      <w:proofErr w:type="spellEnd"/>
+      <w:r>
+        <w:rPr>
+          <w:rFonts w:ascii="Consolas" w:hAnsi="Consolas"/>
+          <w:color w:val="B86855"/>
+          <w:sz w:val="21"/>
+          <w:szCs w:val="21"/>
+          <w:lang w:eastAsia="it-CH"/>
+        </w:rPr>
+        <w:t>}'</w:t>
+      </w:r>
+      <w:r>
+        <w:rPr>
+          <w:rFonts w:ascii="Consolas" w:hAnsi="Consolas"/>
+          <w:color w:val="202020"/>
+          <w:sz w:val="21"/>
+          <w:szCs w:val="21"/>
+          <w:lang w:eastAsia="it-CH"/>
         </w:rPr>
         <w:t xml:space="preserve">, </w:t>
       </w:r>
@@ -13484,7 +13953,7 @@
           <w:color w:val="46969A"/>
           <w:sz w:val="21"/>
           <w:szCs w:val="21"/>
-          <w:lang w:val="fr-CH" w:eastAsia="it-CH"/>
+          <w:lang w:eastAsia="it-CH"/>
         </w:rPr>
         <w:t>VerifyEmailController</w:t>
       </w:r>
@@ -13495,7 +13964,7 @@
           <w:color w:val="573F35"/>
           <w:sz w:val="21"/>
           <w:szCs w:val="21"/>
-          <w:lang w:val="fr-CH" w:eastAsia="it-CH"/>
+          <w:lang w:eastAsia="it-CH"/>
         </w:rPr>
         <w:t>::</w:t>
       </w:r>
@@ -13505,7 +13974,7 @@
           <w:color w:val="5460C1"/>
           <w:sz w:val="21"/>
           <w:szCs w:val="21"/>
-          <w:lang w:val="fr-CH" w:eastAsia="it-CH"/>
+          <w:lang w:eastAsia="it-CH"/>
         </w:rPr>
         <w:t>class</w:t>
       </w:r>
@@ -13515,7 +13984,7 @@
           <w:color w:val="202020"/>
           <w:sz w:val="21"/>
           <w:szCs w:val="21"/>
-          <w:lang w:val="fr-CH" w:eastAsia="it-CH"/>
+          <w:lang w:eastAsia="it-CH"/>
         </w:rPr>
         <w:t>)</w:t>
       </w:r>
@@ -13544,7 +14013,7 @@
           <w:color w:val="202020"/>
           <w:sz w:val="21"/>
           <w:szCs w:val="21"/>
-          <w:lang w:val="fr-CH" w:eastAsia="it-CH"/>
+          <w:lang w:eastAsia="it-CH"/>
         </w:rPr>
         <w:t xml:space="preserve">        </w:t>
       </w:r>
@@ -13558,7 +14027,6 @@
         </w:rPr>
         <w:t>-&gt;</w:t>
       </w:r>
-      <w:proofErr w:type="gramStart"/>
       <w:r>
         <w:rPr>
           <w:rFonts w:ascii="Consolas" w:hAnsi="Consolas"/>
@@ -13577,18 +14045,7 @@
           <w:szCs w:val="21"/>
           <w:lang w:eastAsia="it-CH"/>
         </w:rPr>
-        <w:t>(</w:t>
-      </w:r>
-      <w:proofErr w:type="gramEnd"/>
-      <w:r>
-        <w:rPr>
-          <w:rFonts w:ascii="Consolas" w:hAnsi="Consolas"/>
-          <w:color w:val="202020"/>
-          <w:sz w:val="21"/>
-          <w:szCs w:val="21"/>
-          <w:lang w:eastAsia="it-CH"/>
-        </w:rPr>
-        <w:t>[</w:t>
+        <w:t>([</w:t>
       </w:r>
       <w:r>
         <w:rPr>
@@ -13722,7 +14179,6 @@
         <w:t>'</w:t>
       </w:r>
       <w:proofErr w:type="spellStart"/>
-      <w:proofErr w:type="gramStart"/>
       <w:r>
         <w:rPr>
           <w:rFonts w:ascii="Consolas" w:hAnsi="Consolas"/>
@@ -13734,7 +14190,6 @@
         <w:t>verification.verify</w:t>
       </w:r>
       <w:proofErr w:type="spellEnd"/>
-      <w:proofErr w:type="gramEnd"/>
       <w:r>
         <w:rPr>
           <w:rFonts w:ascii="Consolas" w:hAnsi="Consolas"/>
@@ -13803,7 +14258,6 @@
         </w:rPr>
         <w:t xml:space="preserve">    </w:t>
       </w:r>
-      <w:proofErr w:type="gramStart"/>
       <w:r>
         <w:rPr>
           <w:rFonts w:ascii="Consolas" w:hAnsi="Consolas"/>
@@ -13824,7 +14278,6 @@
         </w:rPr>
         <w:t>::</w:t>
       </w:r>
-      <w:proofErr w:type="gramEnd"/>
       <w:r>
         <w:rPr>
           <w:rFonts w:ascii="Consolas" w:hAnsi="Consolas"/>
@@ -14016,29 +14469,7 @@
           <w:szCs w:val="21"/>
           <w:lang w:val="fr-CH" w:eastAsia="it-CH"/>
         </w:rPr>
-        <w:t>'</w:t>
-      </w:r>
-      <w:proofErr w:type="gramStart"/>
-      <w:r>
-        <w:rPr>
-          <w:rFonts w:ascii="Consolas" w:hAnsi="Consolas"/>
-          <w:color w:val="B86855"/>
-          <w:sz w:val="21"/>
-          <w:szCs w:val="21"/>
-          <w:lang w:val="fr-CH" w:eastAsia="it-CH"/>
-        </w:rPr>
-        <w:t>throttle:</w:t>
-      </w:r>
-      <w:proofErr w:type="gramEnd"/>
-      <w:r>
-        <w:rPr>
-          <w:rFonts w:ascii="Consolas" w:hAnsi="Consolas"/>
-          <w:color w:val="B86855"/>
-          <w:sz w:val="21"/>
-          <w:szCs w:val="21"/>
-          <w:lang w:val="fr-CH" w:eastAsia="it-CH"/>
-        </w:rPr>
-        <w:t>6,1'</w:t>
+        <w:t>'throttle:6,1'</w:t>
       </w:r>
       <w:r>
         <w:rPr>
@@ -14122,7 +14553,6 @@
         <w:t>'</w:t>
       </w:r>
       <w:proofErr w:type="spellStart"/>
-      <w:proofErr w:type="gramStart"/>
       <w:r>
         <w:rPr>
           <w:rFonts w:ascii="Consolas" w:hAnsi="Consolas"/>
@@ -14134,7 +14564,6 @@
         <w:t>verification.send</w:t>
       </w:r>
       <w:proofErr w:type="spellEnd"/>
-      <w:proofErr w:type="gramEnd"/>
       <w:r>
         <w:rPr>
           <w:rFonts w:ascii="Consolas" w:hAnsi="Consolas"/>
@@ -14203,7 +14632,6 @@
         </w:rPr>
         <w:t xml:space="preserve">    </w:t>
       </w:r>
-      <w:proofErr w:type="gramStart"/>
       <w:r>
         <w:rPr>
           <w:rFonts w:ascii="Consolas" w:hAnsi="Consolas"/>
@@ -14225,7 +14653,6 @@
         <w:t>::</w:t>
       </w:r>
       <w:proofErr w:type="spellStart"/>
-      <w:proofErr w:type="gramEnd"/>
       <w:r>
         <w:rPr>
           <w:rFonts w:ascii="Consolas" w:hAnsi="Consolas"/>
@@ -14423,7 +14850,6 @@
         <w:t>'</w:t>
       </w:r>
       <w:proofErr w:type="spellStart"/>
-      <w:proofErr w:type="gramStart"/>
       <w:r>
         <w:rPr>
           <w:rFonts w:ascii="Consolas" w:hAnsi="Consolas"/>
@@ -14435,7 +14861,6 @@
         <w:t>password.confirm</w:t>
       </w:r>
       <w:proofErr w:type="spellEnd"/>
-      <w:proofErr w:type="gramEnd"/>
       <w:r>
         <w:rPr>
           <w:rFonts w:ascii="Consolas" w:hAnsi="Consolas"/>
@@ -14504,7 +14929,6 @@
         </w:rPr>
         <w:t xml:space="preserve">    </w:t>
       </w:r>
-      <w:proofErr w:type="gramStart"/>
       <w:r>
         <w:rPr>
           <w:rFonts w:ascii="Consolas" w:hAnsi="Consolas"/>
@@ -14525,7 +14949,6 @@
         </w:rPr>
         <w:t>::</w:t>
       </w:r>
-      <w:proofErr w:type="gramEnd"/>
       <w:r>
         <w:rPr>
           <w:rFonts w:ascii="Consolas" w:hAnsi="Consolas"/>
@@ -14698,7 +15121,6 @@
         </w:rPr>
         <w:t xml:space="preserve">    </w:t>
       </w:r>
-      <w:proofErr w:type="gramStart"/>
       <w:r>
         <w:rPr>
           <w:rFonts w:ascii="Consolas" w:hAnsi="Consolas"/>
@@ -14719,7 +15141,6 @@
         </w:rPr>
         <w:t>::</w:t>
       </w:r>
-      <w:proofErr w:type="gramEnd"/>
       <w:r>
         <w:rPr>
           <w:rFonts w:ascii="Consolas" w:hAnsi="Consolas"/>
@@ -14966,7 +15387,6 @@
         </w:rPr>
         <w:t xml:space="preserve">    </w:t>
       </w:r>
-      <w:proofErr w:type="gramStart"/>
       <w:r>
         <w:rPr>
           <w:rFonts w:ascii="Consolas" w:hAnsi="Consolas"/>
@@ -14987,7 +15407,6 @@
         </w:rPr>
         <w:t>::</w:t>
       </w:r>
-      <w:proofErr w:type="gramEnd"/>
       <w:r>
         <w:rPr>
           <w:rFonts w:ascii="Consolas" w:hAnsi="Consolas"/>
@@ -15341,7 +15760,6 @@
           <w:lang w:val="fr-CH" w:eastAsia="it-CH"/>
         </w:rPr>
       </w:pPr>
-      <w:proofErr w:type="gramStart"/>
       <w:r>
         <w:rPr>
           <w:rFonts w:ascii="Consolas" w:hAnsi="Consolas"/>
@@ -15353,7 +15771,6 @@
         <w:t>&lt;?</w:t>
       </w:r>
       <w:proofErr w:type="spellStart"/>
-      <w:proofErr w:type="gramEnd"/>
       <w:r>
         <w:rPr>
           <w:rFonts w:ascii="Consolas" w:hAnsi="Consolas"/>
@@ -15404,7 +15821,6 @@
         </w:rPr>
       </w:pPr>
       <w:proofErr w:type="spellStart"/>
-      <w:proofErr w:type="gramStart"/>
       <w:r>
         <w:rPr>
           <w:rFonts w:ascii="Consolas" w:hAnsi="Consolas"/>
@@ -15416,7 +15832,6 @@
         <w:t>namespace</w:t>
       </w:r>
       <w:proofErr w:type="spellEnd"/>
-      <w:proofErr w:type="gramEnd"/>
       <w:r>
         <w:rPr>
           <w:rFonts w:ascii="Consolas" w:hAnsi="Consolas"/>
@@ -15519,7 +15934,6 @@
           <w:lang w:val="fr-CH" w:eastAsia="it-CH"/>
         </w:rPr>
       </w:pPr>
-      <w:proofErr w:type="gramStart"/>
       <w:r>
         <w:rPr>
           <w:rFonts w:ascii="Consolas" w:hAnsi="Consolas"/>
@@ -15530,7 +15944,6 @@
         </w:rPr>
         <w:t>use</w:t>
       </w:r>
-      <w:proofErr w:type="gramEnd"/>
       <w:r>
         <w:rPr>
           <w:rFonts w:ascii="Consolas" w:hAnsi="Consolas"/>
@@ -15602,7 +16015,6 @@
           <w:lang w:val="fr-CH" w:eastAsia="it-CH"/>
         </w:rPr>
       </w:pPr>
-      <w:proofErr w:type="gramStart"/>
       <w:r>
         <w:rPr>
           <w:rFonts w:ascii="Consolas" w:hAnsi="Consolas"/>
@@ -15613,7 +16025,6 @@
         </w:rPr>
         <w:t>use</w:t>
       </w:r>
-      <w:proofErr w:type="gramEnd"/>
       <w:r>
         <w:rPr>
           <w:rFonts w:ascii="Consolas" w:hAnsi="Consolas"/>
@@ -15709,7 +16120,6 @@
           <w:lang w:val="fr-CH" w:eastAsia="it-CH"/>
         </w:rPr>
       </w:pPr>
-      <w:proofErr w:type="gramStart"/>
       <w:r>
         <w:rPr>
           <w:rFonts w:ascii="Consolas" w:hAnsi="Consolas"/>
@@ -15720,7 +16130,6 @@
         </w:rPr>
         <w:t>use</w:t>
       </w:r>
-      <w:proofErr w:type="gramEnd"/>
       <w:r>
         <w:rPr>
           <w:rFonts w:ascii="Consolas" w:hAnsi="Consolas"/>
@@ -15794,7 +16203,6 @@
           <w:lang w:val="fr-CH" w:eastAsia="it-CH"/>
         </w:rPr>
       </w:pPr>
-      <w:proofErr w:type="gramStart"/>
       <w:r>
         <w:rPr>
           <w:rFonts w:ascii="Consolas" w:hAnsi="Consolas"/>
@@ -15805,7 +16213,6 @@
         </w:rPr>
         <w:t>use</w:t>
       </w:r>
-      <w:proofErr w:type="gramEnd"/>
       <w:r>
         <w:rPr>
           <w:rFonts w:ascii="Consolas" w:hAnsi="Consolas"/>
@@ -15879,7 +16286,6 @@
           <w:lang w:val="fr-CH" w:eastAsia="it-CH"/>
         </w:rPr>
       </w:pPr>
-      <w:proofErr w:type="gramStart"/>
       <w:r>
         <w:rPr>
           <w:rFonts w:ascii="Consolas" w:hAnsi="Consolas"/>
@@ -15890,7 +16296,6 @@
         </w:rPr>
         <w:t>use</w:t>
       </w:r>
-      <w:proofErr w:type="gramEnd"/>
       <w:r>
         <w:rPr>
           <w:rFonts w:ascii="Consolas" w:hAnsi="Consolas"/>
@@ -15986,7 +16391,6 @@
           <w:lang w:val="fr-CH" w:eastAsia="it-CH"/>
         </w:rPr>
       </w:pPr>
-      <w:proofErr w:type="gramStart"/>
       <w:r>
         <w:rPr>
           <w:rFonts w:ascii="Consolas" w:hAnsi="Consolas"/>
@@ -15997,7 +16401,6 @@
         </w:rPr>
         <w:t>use</w:t>
       </w:r>
-      <w:proofErr w:type="gramEnd"/>
       <w:r>
         <w:rPr>
           <w:rFonts w:ascii="Consolas" w:hAnsi="Consolas"/>
@@ -16112,7 +16515,6 @@
           <w:lang w:val="fr-CH" w:eastAsia="it-CH"/>
         </w:rPr>
       </w:pPr>
-      <w:proofErr w:type="gramStart"/>
       <w:r>
         <w:rPr>
           <w:rFonts w:ascii="Consolas" w:hAnsi="Consolas"/>
@@ -16123,7 +16525,6 @@
         </w:rPr>
         <w:t>class</w:t>
       </w:r>
-      <w:proofErr w:type="gramEnd"/>
       <w:r>
         <w:rPr>
           <w:rFonts w:ascii="Consolas" w:hAnsi="Consolas"/>
@@ -16365,7 +16766,6 @@
         </w:rPr>
         <w:t xml:space="preserve">    </w:t>
       </w:r>
-      <w:proofErr w:type="gramStart"/>
       <w:r>
         <w:rPr>
           <w:rFonts w:ascii="Consolas" w:hAnsi="Consolas"/>
@@ -16376,7 +16776,6 @@
         </w:rPr>
         <w:t>public</w:t>
       </w:r>
-      <w:proofErr w:type="gramEnd"/>
       <w:r>
         <w:rPr>
           <w:rFonts w:ascii="Consolas" w:hAnsi="Consolas"/>
@@ -16521,7 +16920,6 @@
         </w:rPr>
         <w:t xml:space="preserve">        </w:t>
       </w:r>
-      <w:proofErr w:type="gramStart"/>
       <w:r>
         <w:rPr>
           <w:rFonts w:ascii="Consolas" w:hAnsi="Consolas"/>
@@ -16532,7 +16930,6 @@
         </w:rPr>
         <w:t>return</w:t>
       </w:r>
-      <w:proofErr w:type="gramEnd"/>
       <w:r>
         <w:rPr>
           <w:rFonts w:ascii="Consolas" w:hAnsi="Consolas"/>
@@ -16869,7 +17266,6 @@
         </w:rPr>
         <w:t xml:space="preserve">    </w:t>
       </w:r>
-      <w:proofErr w:type="gramStart"/>
       <w:r>
         <w:rPr>
           <w:rFonts w:ascii="Consolas" w:hAnsi="Consolas"/>
@@ -16880,7 +17276,6 @@
         </w:rPr>
         <w:t>public</w:t>
       </w:r>
-      <w:proofErr w:type="gramEnd"/>
       <w:r>
         <w:rPr>
           <w:rFonts w:ascii="Consolas" w:hAnsi="Consolas"/>
@@ -17110,7 +17505,6 @@
         <w:t>-&gt;</w:t>
       </w:r>
       <w:proofErr w:type="spellStart"/>
-      <w:proofErr w:type="gramStart"/>
       <w:r>
         <w:rPr>
           <w:rFonts w:ascii="Consolas" w:hAnsi="Consolas"/>
@@ -17130,18 +17524,7 @@
           <w:szCs w:val="21"/>
           <w:lang w:val="fr-CH" w:eastAsia="it-CH"/>
         </w:rPr>
-        <w:t>(</w:t>
-      </w:r>
-      <w:proofErr w:type="gramEnd"/>
-      <w:r>
-        <w:rPr>
-          <w:rFonts w:ascii="Consolas" w:hAnsi="Consolas"/>
-          <w:color w:val="202020"/>
-          <w:sz w:val="21"/>
-          <w:szCs w:val="21"/>
-          <w:lang w:val="fr-CH" w:eastAsia="it-CH"/>
-        </w:rPr>
-        <w:t>);</w:t>
+        <w:t>();</w:t>
       </w:r>
     </w:p>
     <w:p>
@@ -17233,7 +17616,6 @@
         </w:rPr>
         <w:t>session</w:t>
       </w:r>
-      <w:proofErr w:type="gramStart"/>
       <w:r>
         <w:rPr>
           <w:rFonts w:ascii="Consolas" w:hAnsi="Consolas"/>
@@ -17252,18 +17634,7 @@
           <w:szCs w:val="21"/>
           <w:lang w:val="fr-CH" w:eastAsia="it-CH"/>
         </w:rPr>
-        <w:t>-</w:t>
-      </w:r>
-      <w:proofErr w:type="gramEnd"/>
-      <w:r>
-        <w:rPr>
-          <w:rFonts w:ascii="Consolas" w:hAnsi="Consolas"/>
-          <w:color w:val="573F35"/>
-          <w:sz w:val="21"/>
-          <w:szCs w:val="21"/>
-          <w:lang w:val="fr-CH" w:eastAsia="it-CH"/>
-        </w:rPr>
-        <w:t>&gt;</w:t>
+        <w:t>-&gt;</w:t>
       </w:r>
       <w:proofErr w:type="spellStart"/>
       <w:r>
@@ -17335,7 +17706,6 @@
         </w:rPr>
         <w:t xml:space="preserve">        </w:t>
       </w:r>
-      <w:proofErr w:type="gramStart"/>
       <w:r>
         <w:rPr>
           <w:rFonts w:ascii="Consolas" w:hAnsi="Consolas"/>
@@ -17346,7 +17716,6 @@
         </w:rPr>
         <w:t>return</w:t>
       </w:r>
-      <w:proofErr w:type="gramEnd"/>
       <w:r>
         <w:rPr>
           <w:rFonts w:ascii="Consolas" w:hAnsi="Consolas"/>
@@ -17692,7 +18061,6 @@
         </w:rPr>
         <w:t xml:space="preserve">    </w:t>
       </w:r>
-      <w:proofErr w:type="gramStart"/>
       <w:r>
         <w:rPr>
           <w:rFonts w:ascii="Consolas" w:hAnsi="Consolas"/>
@@ -17703,7 +18071,6 @@
         </w:rPr>
         <w:t>public</w:t>
       </w:r>
-      <w:proofErr w:type="gramEnd"/>
       <w:r>
         <w:rPr>
           <w:rFonts w:ascii="Consolas" w:hAnsi="Consolas"/>
@@ -17901,7 +18268,6 @@
         <w:t xml:space="preserve">        </w:t>
       </w:r>
       <w:proofErr w:type="spellStart"/>
-      <w:proofErr w:type="gramStart"/>
       <w:r>
         <w:rPr>
           <w:rFonts w:ascii="Consolas" w:hAnsi="Consolas"/>
@@ -17924,7 +18290,6 @@
         <w:t>::</w:t>
       </w:r>
       <w:proofErr w:type="spellStart"/>
-      <w:proofErr w:type="gramEnd"/>
       <w:r>
         <w:rPr>
           <w:rFonts w:ascii="Consolas" w:hAnsi="Consolas"/>
@@ -18088,7 +18453,6 @@
         </w:rPr>
         <w:t>session</w:t>
       </w:r>
-      <w:proofErr w:type="gramStart"/>
       <w:r>
         <w:rPr>
           <w:rFonts w:ascii="Consolas" w:hAnsi="Consolas"/>
@@ -18107,18 +18471,7 @@
           <w:szCs w:val="21"/>
           <w:lang w:val="fr-CH" w:eastAsia="it-CH"/>
         </w:rPr>
-        <w:t>-</w:t>
-      </w:r>
-      <w:proofErr w:type="gramEnd"/>
-      <w:r>
-        <w:rPr>
-          <w:rFonts w:ascii="Consolas" w:hAnsi="Consolas"/>
-          <w:color w:val="573F35"/>
-          <w:sz w:val="21"/>
-          <w:szCs w:val="21"/>
-          <w:lang w:val="fr-CH" w:eastAsia="it-CH"/>
-        </w:rPr>
-        <w:t>&gt;</w:t>
+        <w:t>-&gt;</w:t>
       </w:r>
       <w:proofErr w:type="spellStart"/>
       <w:r>
@@ -18232,7 +18585,6 @@
         </w:rPr>
         <w:t>session</w:t>
       </w:r>
-      <w:proofErr w:type="gramStart"/>
       <w:r>
         <w:rPr>
           <w:rFonts w:ascii="Consolas" w:hAnsi="Consolas"/>
@@ -18251,18 +18603,7 @@
           <w:szCs w:val="21"/>
           <w:lang w:eastAsia="it-CH"/>
         </w:rPr>
-        <w:t>-</w:t>
-      </w:r>
-      <w:proofErr w:type="gramEnd"/>
-      <w:r>
-        <w:rPr>
-          <w:rFonts w:ascii="Consolas" w:hAnsi="Consolas"/>
-          <w:color w:val="573F35"/>
-          <w:sz w:val="21"/>
-          <w:szCs w:val="21"/>
-          <w:lang w:eastAsia="it-CH"/>
-        </w:rPr>
-        <w:t>&gt;</w:t>
+        <w:t>-&gt;</w:t>
       </w:r>
       <w:proofErr w:type="spellStart"/>
       <w:r>
@@ -18357,7 +18698,6 @@
         <w:t xml:space="preserve"> </w:t>
       </w:r>
       <w:proofErr w:type="spellStart"/>
-      <w:proofErr w:type="gramStart"/>
       <w:r>
         <w:rPr>
           <w:rFonts w:ascii="Consolas" w:hAnsi="Consolas"/>
@@ -18379,7 +18719,6 @@
         </w:rPr>
         <w:t>(</w:t>
       </w:r>
-      <w:proofErr w:type="gramEnd"/>
       <w:r>
         <w:rPr>
           <w:rFonts w:ascii="Consolas" w:hAnsi="Consolas"/>
@@ -18439,21 +18778,7 @@
         <w:rPr>
           <w:rFonts w:ascii="Bahnschrift" w:hAnsi="Bahnschrift"/>
         </w:rPr>
-        <w:t xml:space="preserve">Il metodo </w:t>
-      </w:r>
-      <w:proofErr w:type="gramStart"/>
-      <w:r>
-        <w:rPr>
-          <w:rFonts w:ascii="Bahnschrift" w:hAnsi="Bahnschrift"/>
-        </w:rPr>
-        <w:t>create(</w:t>
-      </w:r>
-      <w:proofErr w:type="gramEnd"/>
-      <w:r>
-        <w:rPr>
-          <w:rFonts w:ascii="Bahnschrift" w:hAnsi="Bahnschrift"/>
-        </w:rPr>
-        <w:t>) serve semplicemente a mostrare la pagina di login.</w:t>
+        <w:t>Il metodo create() serve semplicemente a mostrare la pagina di login.</w:t>
       </w:r>
       <w:r>
         <w:rPr>
@@ -18787,7 +19112,6 @@
         <w:t xml:space="preserve"> </w:t>
       </w:r>
       <w:proofErr w:type="spellStart"/>
-      <w:proofErr w:type="gramStart"/>
       <w:r>
         <w:rPr>
           <w:rFonts w:ascii="Consolas" w:hAnsi="Consolas"/>
@@ -18807,18 +19131,7 @@
           <w:szCs w:val="21"/>
           <w:lang w:eastAsia="it-CH"/>
         </w:rPr>
-        <w:t>(</w:t>
-      </w:r>
-      <w:proofErr w:type="gramEnd"/>
-      <w:r>
-        <w:rPr>
-          <w:rFonts w:ascii="Consolas" w:hAnsi="Consolas"/>
-          <w:color w:val="202020"/>
-          <w:sz w:val="21"/>
-          <w:szCs w:val="21"/>
-          <w:lang w:eastAsia="it-CH"/>
-        </w:rPr>
-        <w:t>)</w:t>
+        <w:t>()</w:t>
       </w:r>
       <w:r>
         <w:rPr>
@@ -18998,7 +19311,6 @@
         <w:t xml:space="preserve">La funzione </w:t>
       </w:r>
       <w:proofErr w:type="spellStart"/>
-      <w:proofErr w:type="gramStart"/>
       <w:r>
         <w:rPr>
           <w:rFonts w:ascii="Bahnschrift" w:hAnsi="Bahnschrift"/>
@@ -19010,14 +19322,7 @@
         <w:rPr>
           <w:rFonts w:ascii="Bahnschrift" w:hAnsi="Bahnschrift"/>
         </w:rPr>
-        <w:t>(</w:t>
-      </w:r>
-      <w:proofErr w:type="gramEnd"/>
-      <w:r>
-        <w:rPr>
-          <w:rFonts w:ascii="Bahnschrift" w:hAnsi="Bahnschrift"/>
-        </w:rPr>
-        <w:t xml:space="preserve">) serve a decidere se l’utente è autorizzato a inviare questa richiesta. In questo caso ritorna sempre </w:t>
+        <w:t xml:space="preserve">() serve a decidere se l’utente è autorizzato a inviare questa richiesta. In questo caso ritorna sempre </w:t>
       </w:r>
       <w:proofErr w:type="spellStart"/>
       <w:r>
@@ -19074,7 +19379,6 @@
         </w:rPr>
         <w:t xml:space="preserve">    </w:t>
       </w:r>
-      <w:proofErr w:type="gramStart"/>
       <w:r>
         <w:rPr>
           <w:rFonts w:ascii="Consolas" w:hAnsi="Consolas"/>
@@ -19085,7 +19389,6 @@
         </w:rPr>
         <w:t>public</w:t>
       </w:r>
-      <w:proofErr w:type="gramEnd"/>
       <w:r>
         <w:rPr>
           <w:rFonts w:ascii="Consolas" w:hAnsi="Consolas"/>
@@ -19230,7 +19533,6 @@
         </w:rPr>
         <w:t xml:space="preserve">        </w:t>
       </w:r>
-      <w:proofErr w:type="gramStart"/>
       <w:r>
         <w:rPr>
           <w:rFonts w:ascii="Consolas" w:hAnsi="Consolas"/>
@@ -19241,7 +19543,6 @@
         </w:rPr>
         <w:t>return</w:t>
       </w:r>
-      <w:proofErr w:type="gramEnd"/>
       <w:r>
         <w:rPr>
           <w:rFonts w:ascii="Consolas" w:hAnsi="Consolas"/>
@@ -19268,7 +19569,7 @@
           <w:color w:val="202020"/>
           <w:sz w:val="21"/>
           <w:szCs w:val="21"/>
-          <w:lang w:val="fr-CH" w:eastAsia="it-CH"/>
+          <w:lang w:eastAsia="it-CH"/>
         </w:rPr>
       </w:pPr>
       <w:r>
@@ -19287,7 +19588,7 @@
           <w:color w:val="B86855"/>
           <w:sz w:val="21"/>
           <w:szCs w:val="21"/>
-          <w:lang w:val="fr-CH" w:eastAsia="it-CH"/>
+          <w:lang w:eastAsia="it-CH"/>
         </w:rPr>
         <w:t>'email'</w:t>
       </w:r>
@@ -19297,7 +19598,7 @@
           <w:color w:val="202020"/>
           <w:sz w:val="21"/>
           <w:szCs w:val="21"/>
-          <w:lang w:val="fr-CH" w:eastAsia="it-CH"/>
+          <w:lang w:eastAsia="it-CH"/>
         </w:rPr>
         <w:t xml:space="preserve"> </w:t>
       </w:r>
@@ -19307,7 +19608,7 @@
           <w:color w:val="573F35"/>
           <w:sz w:val="21"/>
           <w:szCs w:val="21"/>
-          <w:lang w:val="fr-CH" w:eastAsia="it-CH"/>
+          <w:lang w:eastAsia="it-CH"/>
         </w:rPr>
         <w:t>=&gt;</w:t>
       </w:r>
@@ -19317,7 +19618,7 @@
           <w:color w:val="202020"/>
           <w:sz w:val="21"/>
           <w:szCs w:val="21"/>
-          <w:lang w:val="fr-CH" w:eastAsia="it-CH"/>
+          <w:lang w:eastAsia="it-CH"/>
         </w:rPr>
         <w:t xml:space="preserve"> [</w:t>
       </w:r>
@@ -19327,7 +19628,7 @@
           <w:color w:val="B86855"/>
           <w:sz w:val="21"/>
           <w:szCs w:val="21"/>
-          <w:lang w:val="fr-CH" w:eastAsia="it-CH"/>
+          <w:lang w:eastAsia="it-CH"/>
         </w:rPr>
         <w:t>'</w:t>
       </w:r>
@@ -19338,7 +19639,7 @@
           <w:color w:val="B86855"/>
           <w:sz w:val="21"/>
           <w:szCs w:val="21"/>
-          <w:lang w:val="fr-CH" w:eastAsia="it-CH"/>
+          <w:lang w:eastAsia="it-CH"/>
         </w:rPr>
         <w:t>required</w:t>
       </w:r>
@@ -19349,7 +19650,7 @@
           <w:color w:val="B86855"/>
           <w:sz w:val="21"/>
           <w:szCs w:val="21"/>
-          <w:lang w:val="fr-CH" w:eastAsia="it-CH"/>
+          <w:lang w:eastAsia="it-CH"/>
         </w:rPr>
         <w:t>'</w:t>
       </w:r>
@@ -19359,7 +19660,7 @@
           <w:color w:val="202020"/>
           <w:sz w:val="21"/>
           <w:szCs w:val="21"/>
-          <w:lang w:val="fr-CH" w:eastAsia="it-CH"/>
+          <w:lang w:eastAsia="it-CH"/>
         </w:rPr>
         <w:t xml:space="preserve">, </w:t>
       </w:r>
@@ -19369,17 +19670,39 @@
           <w:color w:val="B86855"/>
           <w:sz w:val="21"/>
           <w:szCs w:val="21"/>
-          <w:lang w:val="fr-CH" w:eastAsia="it-CH"/>
-        </w:rPr>
-        <w:t>'string'</w:t>
-      </w:r>
-      <w:r>
-        <w:rPr>
-          <w:rFonts w:ascii="Consolas" w:hAnsi="Consolas"/>
-          <w:color w:val="202020"/>
-          <w:sz w:val="21"/>
-          <w:szCs w:val="21"/>
-          <w:lang w:val="fr-CH" w:eastAsia="it-CH"/>
+          <w:lang w:eastAsia="it-CH"/>
+        </w:rPr>
+        <w:t>'</w:t>
+      </w:r>
+      <w:proofErr w:type="spellStart"/>
+      <w:r>
+        <w:rPr>
+          <w:rFonts w:ascii="Consolas" w:hAnsi="Consolas"/>
+          <w:color w:val="B86855"/>
+          <w:sz w:val="21"/>
+          <w:szCs w:val="21"/>
+          <w:lang w:eastAsia="it-CH"/>
+        </w:rPr>
+        <w:t>string</w:t>
+      </w:r>
+      <w:proofErr w:type="spellEnd"/>
+      <w:r>
+        <w:rPr>
+          <w:rFonts w:ascii="Consolas" w:hAnsi="Consolas"/>
+          <w:color w:val="B86855"/>
+          <w:sz w:val="21"/>
+          <w:szCs w:val="21"/>
+          <w:lang w:eastAsia="it-CH"/>
+        </w:rPr>
+        <w:t>'</w:t>
+      </w:r>
+      <w:r>
+        <w:rPr>
+          <w:rFonts w:ascii="Consolas" w:hAnsi="Consolas"/>
+          <w:color w:val="202020"/>
+          <w:sz w:val="21"/>
+          <w:szCs w:val="21"/>
+          <w:lang w:eastAsia="it-CH"/>
         </w:rPr>
         <w:t xml:space="preserve">, </w:t>
       </w:r>
@@ -19389,7 +19712,7 @@
           <w:color w:val="B86855"/>
           <w:sz w:val="21"/>
           <w:szCs w:val="21"/>
-          <w:lang w:val="fr-CH" w:eastAsia="it-CH"/>
+          <w:lang w:eastAsia="it-CH"/>
         </w:rPr>
         <w:t>'email'</w:t>
       </w:r>
@@ -19399,7 +19722,7 @@
           <w:color w:val="202020"/>
           <w:sz w:val="21"/>
           <w:szCs w:val="21"/>
-          <w:lang w:val="fr-CH" w:eastAsia="it-CH"/>
+          <w:lang w:eastAsia="it-CH"/>
         </w:rPr>
         <w:t>],</w:t>
       </w:r>
@@ -19428,7 +19751,7 @@
           <w:color w:val="202020"/>
           <w:sz w:val="21"/>
           <w:szCs w:val="21"/>
-          <w:lang w:val="fr-CH" w:eastAsia="it-CH"/>
+          <w:lang w:eastAsia="it-CH"/>
         </w:rPr>
         <w:t xml:space="preserve">            </w:t>
       </w:r>
@@ -19626,21 +19949,7 @@
         <w:rPr>
           <w:rFonts w:ascii="Bahnschrift" w:hAnsi="Bahnschrift"/>
         </w:rPr>
-        <w:t xml:space="preserve">La funzione </w:t>
-      </w:r>
-      <w:proofErr w:type="gramStart"/>
-      <w:r>
-        <w:rPr>
-          <w:rFonts w:ascii="Bahnschrift" w:hAnsi="Bahnschrift"/>
-        </w:rPr>
-        <w:t>rules(</w:t>
-      </w:r>
-      <w:proofErr w:type="gramEnd"/>
-      <w:r>
-        <w:rPr>
-          <w:rFonts w:ascii="Bahnschrift" w:hAnsi="Bahnschrift"/>
-        </w:rPr>
-        <w:t xml:space="preserve">) restituisce un array contenente le regole di validazione applicate ai campi del </w:t>
+        <w:t xml:space="preserve">La funzione rules() restituisce un array contenente le regole di validazione applicate ai campi del </w:t>
       </w:r>
       <w:proofErr w:type="spellStart"/>
       <w:r>
@@ -19728,7 +20037,6 @@
         </w:rPr>
         <w:t xml:space="preserve">    </w:t>
       </w:r>
-      <w:proofErr w:type="gramStart"/>
       <w:r>
         <w:rPr>
           <w:rFonts w:ascii="Consolas" w:hAnsi="Consolas"/>
@@ -19739,7 +20047,6 @@
         </w:rPr>
         <w:t>public</w:t>
       </w:r>
-      <w:proofErr w:type="gramEnd"/>
       <w:r>
         <w:rPr>
           <w:rFonts w:ascii="Consolas" w:hAnsi="Consolas"/>
@@ -19917,7 +20224,6 @@
         <w:t>-&gt;</w:t>
       </w:r>
       <w:proofErr w:type="spellStart"/>
-      <w:proofErr w:type="gramStart"/>
       <w:r>
         <w:rPr>
           <w:rFonts w:ascii="Consolas" w:hAnsi="Consolas"/>
@@ -19937,18 +20243,7 @@
           <w:szCs w:val="21"/>
           <w:lang w:val="fr-CH" w:eastAsia="it-CH"/>
         </w:rPr>
-        <w:t>(</w:t>
-      </w:r>
-      <w:proofErr w:type="gramEnd"/>
-      <w:r>
-        <w:rPr>
-          <w:rFonts w:ascii="Consolas" w:hAnsi="Consolas"/>
-          <w:color w:val="202020"/>
-          <w:sz w:val="21"/>
-          <w:szCs w:val="21"/>
-          <w:lang w:val="fr-CH" w:eastAsia="it-CH"/>
-        </w:rPr>
-        <w:t>);</w:t>
+        <w:t>();</w:t>
       </w:r>
     </w:p>
     <w:p>
@@ -19998,7 +20293,6 @@
         </w:rPr>
         <w:t xml:space="preserve">        </w:t>
       </w:r>
-      <w:proofErr w:type="gramStart"/>
       <w:r>
         <w:rPr>
           <w:rFonts w:ascii="Consolas" w:hAnsi="Consolas"/>
@@ -20009,7 +20303,6 @@
         </w:rPr>
         <w:t>if</w:t>
       </w:r>
-      <w:proofErr w:type="gramEnd"/>
       <w:r>
         <w:rPr>
           <w:rFonts w:ascii="Consolas" w:hAnsi="Consolas"/>
@@ -20041,7 +20334,6 @@
         <w:t xml:space="preserve"> </w:t>
       </w:r>
       <w:proofErr w:type="spellStart"/>
-      <w:proofErr w:type="gramStart"/>
       <w:r>
         <w:rPr>
           <w:rFonts w:ascii="Consolas" w:hAnsi="Consolas"/>
@@ -20064,7 +20356,6 @@
         <w:t>::</w:t>
       </w:r>
       <w:proofErr w:type="spellStart"/>
-      <w:proofErr w:type="gramEnd"/>
       <w:r>
         <w:rPr>
           <w:rFonts w:ascii="Consolas" w:hAnsi="Consolas"/>
@@ -20328,7 +20619,6 @@
         <w:t xml:space="preserve">            </w:t>
       </w:r>
       <w:proofErr w:type="spellStart"/>
-      <w:proofErr w:type="gramStart"/>
       <w:r>
         <w:rPr>
           <w:rFonts w:ascii="Consolas" w:hAnsi="Consolas"/>
@@ -20350,7 +20640,6 @@
         </w:rPr>
         <w:t>::</w:t>
       </w:r>
-      <w:proofErr w:type="gramEnd"/>
       <w:r>
         <w:rPr>
           <w:rFonts w:ascii="Consolas" w:hAnsi="Consolas"/>
@@ -20474,7 +20763,6 @@
         <w:t xml:space="preserve">            </w:t>
       </w:r>
       <w:proofErr w:type="spellStart"/>
-      <w:proofErr w:type="gramStart"/>
       <w:r>
         <w:rPr>
           <w:rFonts w:ascii="Consolas" w:hAnsi="Consolas"/>
@@ -20486,7 +20774,6 @@
         <w:t>throw</w:t>
       </w:r>
       <w:proofErr w:type="spellEnd"/>
-      <w:proofErr w:type="gramEnd"/>
       <w:r>
         <w:rPr>
           <w:rFonts w:ascii="Consolas" w:hAnsi="Consolas"/>
@@ -20641,7 +20928,6 @@
         <w:t>'</w:t>
       </w:r>
       <w:proofErr w:type="spellStart"/>
-      <w:proofErr w:type="gramStart"/>
       <w:r>
         <w:rPr>
           <w:rFonts w:ascii="Consolas" w:hAnsi="Consolas"/>
@@ -20653,7 +20939,6 @@
         <w:t>auth.failed</w:t>
       </w:r>
       <w:proofErr w:type="spellEnd"/>
-      <w:proofErr w:type="gramEnd"/>
       <w:r>
         <w:rPr>
           <w:rFonts w:ascii="Consolas" w:hAnsi="Consolas"/>
@@ -20781,7 +21066,6 @@
         <w:t xml:space="preserve">        </w:t>
       </w:r>
       <w:proofErr w:type="spellStart"/>
-      <w:proofErr w:type="gramStart"/>
       <w:r>
         <w:rPr>
           <w:rFonts w:ascii="Consolas" w:hAnsi="Consolas"/>
@@ -20804,7 +21088,6 @@
         <w:t>::</w:t>
       </w:r>
       <w:proofErr w:type="spellStart"/>
-      <w:proofErr w:type="gramEnd"/>
       <w:r>
         <w:rPr>
           <w:rFonts w:ascii="Consolas" w:hAnsi="Consolas"/>
@@ -20896,7 +21179,7 @@
           <w:color w:val="202020"/>
           <w:sz w:val="21"/>
           <w:szCs w:val="21"/>
-          <w:lang w:val="fr-CH" w:eastAsia="it-CH"/>
+          <w:lang w:eastAsia="it-CH"/>
         </w:rPr>
       </w:pPr>
       <w:r>
@@ -20915,7 +21198,7 @@
           <w:color w:val="202020"/>
           <w:sz w:val="21"/>
           <w:szCs w:val="21"/>
-          <w:lang w:val="fr-CH" w:eastAsia="it-CH"/>
+          <w:lang w:eastAsia="it-CH"/>
         </w:rPr>
         <w:t>}</w:t>
       </w:r>
@@ -20934,7 +21217,6 @@
         <w:t xml:space="preserve">La funzione </w:t>
       </w:r>
       <w:proofErr w:type="spellStart"/>
-      <w:proofErr w:type="gramStart"/>
       <w:r>
         <w:rPr>
           <w:rFonts w:ascii="Bahnschrift" w:hAnsi="Bahnschrift"/>
@@ -20946,14 +21228,7 @@
         <w:rPr>
           <w:rFonts w:ascii="Bahnschrift" w:hAnsi="Bahnschrift"/>
         </w:rPr>
-        <w:t>(</w:t>
-      </w:r>
-      <w:proofErr w:type="gramEnd"/>
-      <w:r>
-        <w:rPr>
-          <w:rFonts w:ascii="Bahnschrift" w:hAnsi="Bahnschrift"/>
-        </w:rPr>
-        <w:t>) si occupa di effettuare il tentativo di accesso dell’utente.</w:t>
+        <w:t>() si occupa di effettuare il tentativo di accesso dell’utente.</w:t>
       </w:r>
       <w:r>
         <w:rPr>
@@ -21092,7 +21367,6 @@
         <w:t xml:space="preserve"> </w:t>
       </w:r>
       <w:proofErr w:type="spellStart"/>
-      <w:proofErr w:type="gramStart"/>
       <w:r>
         <w:rPr>
           <w:rFonts w:ascii="Consolas" w:hAnsi="Consolas"/>
@@ -21112,18 +21386,7 @@
           <w:szCs w:val="21"/>
           <w:lang w:eastAsia="it-CH"/>
         </w:rPr>
-        <w:t>(</w:t>
-      </w:r>
-      <w:proofErr w:type="gramEnd"/>
-      <w:r>
-        <w:rPr>
-          <w:rFonts w:ascii="Consolas" w:hAnsi="Consolas"/>
-          <w:color w:val="202020"/>
-          <w:sz w:val="21"/>
-          <w:szCs w:val="21"/>
-          <w:lang w:eastAsia="it-CH"/>
-        </w:rPr>
-        <w:t>)</w:t>
+        <w:t>()</w:t>
       </w:r>
       <w:r>
         <w:rPr>
@@ -21202,7 +21465,7 @@
           <w:color w:val="202020"/>
           <w:sz w:val="21"/>
           <w:szCs w:val="21"/>
-          <w:lang w:val="de-CH" w:eastAsia="it-CH"/>
+          <w:lang w:eastAsia="it-CH"/>
         </w:rPr>
       </w:pPr>
       <w:r>
@@ -21222,7 +21485,7 @@
           <w:color w:val="8F41AD"/>
           <w:sz w:val="21"/>
           <w:szCs w:val="21"/>
-          <w:lang w:val="de-CH" w:eastAsia="it-CH"/>
+          <w:lang w:eastAsia="it-CH"/>
         </w:rPr>
         <w:t>return</w:t>
       </w:r>
@@ -21233,18 +21496,17 @@
           <w:color w:val="202020"/>
           <w:sz w:val="21"/>
           <w:szCs w:val="21"/>
-          <w:lang w:val="de-CH" w:eastAsia="it-CH"/>
+          <w:lang w:eastAsia="it-CH"/>
         </w:rPr>
         <w:t xml:space="preserve"> </w:t>
       </w:r>
-      <w:proofErr w:type="gramStart"/>
       <w:r>
         <w:rPr>
           <w:rFonts w:ascii="Consolas" w:hAnsi="Consolas"/>
           <w:color w:val="46969A"/>
           <w:sz w:val="21"/>
           <w:szCs w:val="21"/>
-          <w:lang w:val="de-CH" w:eastAsia="it-CH"/>
+          <w:lang w:eastAsia="it-CH"/>
         </w:rPr>
         <w:t>Str</w:t>
       </w:r>
@@ -21254,18 +21516,17 @@
           <w:color w:val="573F35"/>
           <w:sz w:val="21"/>
           <w:szCs w:val="21"/>
-          <w:lang w:val="de-CH" w:eastAsia="it-CH"/>
+          <w:lang w:eastAsia="it-CH"/>
         </w:rPr>
         <w:t>::</w:t>
       </w:r>
-      <w:proofErr w:type="gramEnd"/>
       <w:r>
         <w:rPr>
           <w:rFonts w:ascii="Consolas" w:hAnsi="Consolas"/>
           <w:color w:val="98863B"/>
           <w:sz w:val="21"/>
           <w:szCs w:val="21"/>
-          <w:lang w:val="de-CH" w:eastAsia="it-CH"/>
+          <w:lang w:eastAsia="it-CH"/>
         </w:rPr>
         <w:t>transliterate</w:t>
       </w:r>
@@ -21275,7 +21536,7 @@
           <w:color w:val="202020"/>
           <w:sz w:val="21"/>
           <w:szCs w:val="21"/>
-          <w:lang w:val="de-CH" w:eastAsia="it-CH"/>
+          <w:lang w:eastAsia="it-CH"/>
         </w:rPr>
         <w:t>(</w:t>
       </w:r>
@@ -21285,7 +21546,7 @@
           <w:color w:val="46969A"/>
           <w:sz w:val="21"/>
           <w:szCs w:val="21"/>
-          <w:lang w:val="de-CH" w:eastAsia="it-CH"/>
+          <w:lang w:eastAsia="it-CH"/>
         </w:rPr>
         <w:t>Str</w:t>
       </w:r>
@@ -21295,7 +21556,7 @@
           <w:color w:val="573F35"/>
           <w:sz w:val="21"/>
           <w:szCs w:val="21"/>
-          <w:lang w:val="de-CH" w:eastAsia="it-CH"/>
+          <w:lang w:eastAsia="it-CH"/>
         </w:rPr>
         <w:t>::</w:t>
       </w:r>
@@ -21305,7 +21566,7 @@
           <w:color w:val="98863B"/>
           <w:sz w:val="21"/>
           <w:szCs w:val="21"/>
-          <w:lang w:val="de-CH" w:eastAsia="it-CH"/>
+          <w:lang w:eastAsia="it-CH"/>
         </w:rPr>
         <w:t>lower</w:t>
       </w:r>
@@ -21315,7 +21576,7 @@
           <w:color w:val="202020"/>
           <w:sz w:val="21"/>
           <w:szCs w:val="21"/>
-          <w:lang w:val="de-CH" w:eastAsia="it-CH"/>
+          <w:lang w:eastAsia="it-CH"/>
         </w:rPr>
         <w:t>(</w:t>
       </w:r>
@@ -21325,7 +21586,7 @@
           <w:color w:val="282D85"/>
           <w:sz w:val="21"/>
           <w:szCs w:val="21"/>
-          <w:lang w:val="de-CH" w:eastAsia="it-CH"/>
+          <w:lang w:eastAsia="it-CH"/>
         </w:rPr>
         <w:t>$this</w:t>
       </w:r>
@@ -21335,7 +21596,7 @@
           <w:color w:val="573F35"/>
           <w:sz w:val="21"/>
           <w:szCs w:val="21"/>
-          <w:lang w:val="de-CH" w:eastAsia="it-CH"/>
+          <w:lang w:eastAsia="it-CH"/>
         </w:rPr>
         <w:t>-&gt;</w:t>
       </w:r>
@@ -21345,7 +21606,7 @@
           <w:color w:val="98863B"/>
           <w:sz w:val="21"/>
           <w:szCs w:val="21"/>
-          <w:lang w:val="de-CH" w:eastAsia="it-CH"/>
+          <w:lang w:eastAsia="it-CH"/>
         </w:rPr>
         <w:t>string</w:t>
       </w:r>
@@ -21355,7 +21616,7 @@
           <w:color w:val="202020"/>
           <w:sz w:val="21"/>
           <w:szCs w:val="21"/>
-          <w:lang w:val="de-CH" w:eastAsia="it-CH"/>
+          <w:lang w:eastAsia="it-CH"/>
         </w:rPr>
         <w:t>(</w:t>
       </w:r>
@@ -21365,7 +21626,7 @@
           <w:color w:val="B86855"/>
           <w:sz w:val="21"/>
           <w:szCs w:val="21"/>
-          <w:lang w:val="de-CH" w:eastAsia="it-CH"/>
+          <w:lang w:eastAsia="it-CH"/>
         </w:rPr>
         <w:t>'email'</w:t>
       </w:r>
@@ -21375,7 +21636,7 @@
           <w:color w:val="202020"/>
           <w:sz w:val="21"/>
           <w:szCs w:val="21"/>
-          <w:lang w:val="de-CH" w:eastAsia="it-CH"/>
+          <w:lang w:eastAsia="it-CH"/>
         </w:rPr>
         <w:t>))</w:t>
       </w:r>
@@ -21385,7 +21646,7 @@
           <w:color w:val="573F35"/>
           <w:sz w:val="21"/>
           <w:szCs w:val="21"/>
-          <w:lang w:val="de-CH" w:eastAsia="it-CH"/>
+          <w:lang w:eastAsia="it-CH"/>
         </w:rPr>
         <w:t>.</w:t>
       </w:r>
@@ -21395,7 +21656,7 @@
           <w:color w:val="B86855"/>
           <w:sz w:val="21"/>
           <w:szCs w:val="21"/>
-          <w:lang w:val="de-CH" w:eastAsia="it-CH"/>
+          <w:lang w:eastAsia="it-CH"/>
         </w:rPr>
         <w:t>'|'</w:t>
       </w:r>
@@ -21405,7 +21666,7 @@
           <w:color w:val="573F35"/>
           <w:sz w:val="21"/>
           <w:szCs w:val="21"/>
-          <w:lang w:val="de-CH" w:eastAsia="it-CH"/>
+          <w:lang w:eastAsia="it-CH"/>
         </w:rPr>
         <w:t>.</w:t>
       </w:r>
@@ -21415,7 +21676,7 @@
           <w:color w:val="282D85"/>
           <w:sz w:val="21"/>
           <w:szCs w:val="21"/>
-          <w:lang w:val="de-CH" w:eastAsia="it-CH"/>
+          <w:lang w:eastAsia="it-CH"/>
         </w:rPr>
         <w:t>$this</w:t>
       </w:r>
@@ -21425,7 +21686,7 @@
           <w:color w:val="573F35"/>
           <w:sz w:val="21"/>
           <w:szCs w:val="21"/>
-          <w:lang w:val="de-CH" w:eastAsia="it-CH"/>
+          <w:lang w:eastAsia="it-CH"/>
         </w:rPr>
         <w:t>-&gt;</w:t>
       </w:r>
@@ -21435,7 +21696,7 @@
           <w:color w:val="98863B"/>
           <w:sz w:val="21"/>
           <w:szCs w:val="21"/>
-          <w:lang w:val="de-CH" w:eastAsia="it-CH"/>
+          <w:lang w:eastAsia="it-CH"/>
         </w:rPr>
         <w:t>ip</w:t>
       </w:r>
@@ -21445,7 +21706,7 @@
           <w:color w:val="202020"/>
           <w:sz w:val="21"/>
           <w:szCs w:val="21"/>
-          <w:lang w:val="de-CH" w:eastAsia="it-CH"/>
+          <w:lang w:eastAsia="it-CH"/>
         </w:rPr>
         <w:t>());</w:t>
       </w:r>
@@ -21474,7 +21735,7 @@
           <w:color w:val="202020"/>
           <w:sz w:val="21"/>
           <w:szCs w:val="21"/>
-          <w:lang w:val="de-CH" w:eastAsia="it-CH"/>
+          <w:lang w:eastAsia="it-CH"/>
         </w:rPr>
         <w:t xml:space="preserve">    </w:t>
       </w:r>
@@ -21517,7 +21778,6 @@
         <w:t xml:space="preserve">La funzione </w:t>
       </w:r>
       <w:proofErr w:type="spellStart"/>
-      <w:proofErr w:type="gramStart"/>
       <w:r>
         <w:rPr>
           <w:sz w:val="24"/>
@@ -21533,16 +21793,7 @@
           <w:szCs w:val="24"/>
           <w:lang w:eastAsia="it-CH"/>
         </w:rPr>
-        <w:t>(</w:t>
-      </w:r>
-      <w:proofErr w:type="gramEnd"/>
-      <w:r>
-        <w:rPr>
-          <w:sz w:val="24"/>
-          <w:szCs w:val="24"/>
-          <w:lang w:eastAsia="it-CH"/>
-        </w:rPr>
-        <w:t>) genera una chiave univoca utilizzata per il sistema di limitazione dei tentativi di login.</w:t>
+        <w:t>() genera una chiave univoca utilizzata per il sistema di limitazione dei tentativi di login.</w:t>
       </w:r>
       <w:r>
         <w:rPr>
@@ -21588,7 +21839,7 @@
           <w:color w:val="202020"/>
           <w:sz w:val="21"/>
           <w:szCs w:val="21"/>
-          <w:lang w:eastAsia="it-CH"/>
+          <w:lang w:val="fr-CH" w:eastAsia="it-CH"/>
         </w:rPr>
       </w:pPr>
       <w:r>
@@ -21597,7 +21848,7 @@
           <w:color w:val="5460C1"/>
           <w:sz w:val="21"/>
           <w:szCs w:val="21"/>
-          <w:lang w:eastAsia="it-CH"/>
+          <w:lang w:val="fr-CH" w:eastAsia="it-CH"/>
         </w:rPr>
         <w:lastRenderedPageBreak/>
         <w:t>public</w:t>
@@ -21608,7 +21859,7 @@
           <w:color w:val="202020"/>
           <w:sz w:val="21"/>
           <w:szCs w:val="21"/>
-          <w:lang w:eastAsia="it-CH"/>
+          <w:lang w:val="fr-CH" w:eastAsia="it-CH"/>
         </w:rPr>
         <w:t xml:space="preserve"> </w:t>
       </w:r>
@@ -21619,7 +21870,7 @@
           <w:color w:val="5460C1"/>
           <w:sz w:val="21"/>
           <w:szCs w:val="21"/>
-          <w:lang w:eastAsia="it-CH"/>
+          <w:lang w:val="fr-CH" w:eastAsia="it-CH"/>
         </w:rPr>
         <w:t>function</w:t>
       </w:r>
@@ -21630,19 +21881,18 @@
           <w:color w:val="202020"/>
           <w:sz w:val="21"/>
           <w:szCs w:val="21"/>
-          <w:lang w:eastAsia="it-CH"/>
+          <w:lang w:val="fr-CH" w:eastAsia="it-CH"/>
         </w:rPr>
         <w:t xml:space="preserve"> </w:t>
       </w:r>
       <w:proofErr w:type="spellStart"/>
-      <w:proofErr w:type="gramStart"/>
       <w:r>
         <w:rPr>
           <w:rFonts w:ascii="Consolas" w:hAnsi="Consolas"/>
           <w:color w:val="98863B"/>
           <w:sz w:val="21"/>
           <w:szCs w:val="21"/>
-          <w:lang w:eastAsia="it-CH"/>
+          <w:lang w:val="fr-CH" w:eastAsia="it-CH"/>
         </w:rPr>
         <w:t>ensureIsNotRateLimited</w:t>
       </w:r>
@@ -21653,20 +21903,9 @@
           <w:color w:val="202020"/>
           <w:sz w:val="21"/>
           <w:szCs w:val="21"/>
-          <w:lang w:eastAsia="it-CH"/>
-        </w:rPr>
-        <w:t>(</w:t>
-      </w:r>
-      <w:proofErr w:type="gramEnd"/>
-      <w:r>
-        <w:rPr>
-          <w:rFonts w:ascii="Consolas" w:hAnsi="Consolas"/>
-          <w:color w:val="202020"/>
-          <w:sz w:val="21"/>
-          <w:szCs w:val="21"/>
-          <w:lang w:eastAsia="it-CH"/>
-        </w:rPr>
-        <w:t>)</w:t>
+          <w:lang w:val="fr-CH" w:eastAsia="it-CH"/>
+        </w:rPr>
+        <w:t>()</w:t>
       </w:r>
       <w:r>
         <w:rPr>
@@ -21674,7 +21913,7 @@
           <w:color w:val="573F35"/>
           <w:sz w:val="21"/>
           <w:szCs w:val="21"/>
-          <w:lang w:eastAsia="it-CH"/>
+          <w:lang w:val="fr-CH" w:eastAsia="it-CH"/>
         </w:rPr>
         <w:t>:</w:t>
       </w:r>
@@ -21684,7 +21923,7 @@
           <w:color w:val="202020"/>
           <w:sz w:val="21"/>
           <w:szCs w:val="21"/>
-          <w:lang w:eastAsia="it-CH"/>
+          <w:lang w:val="fr-CH" w:eastAsia="it-CH"/>
         </w:rPr>
         <w:t xml:space="preserve"> </w:t>
       </w:r>
@@ -21695,7 +21934,7 @@
           <w:color w:val="5460C1"/>
           <w:sz w:val="21"/>
           <w:szCs w:val="21"/>
-          <w:lang w:eastAsia="it-CH"/>
+          <w:lang w:val="fr-CH" w:eastAsia="it-CH"/>
         </w:rPr>
         <w:t>void</w:t>
       </w:r>
@@ -21725,7 +21964,7 @@
           <w:color w:val="202020"/>
           <w:sz w:val="21"/>
           <w:szCs w:val="21"/>
-          <w:lang w:eastAsia="it-CH"/>
+          <w:lang w:val="fr-CH" w:eastAsia="it-CH"/>
         </w:rPr>
         <w:t xml:space="preserve">    </w:t>
       </w:r>
@@ -21768,7 +22007,6 @@
         </w:rPr>
         <w:t xml:space="preserve">        </w:t>
       </w:r>
-      <w:proofErr w:type="gramStart"/>
       <w:r>
         <w:rPr>
           <w:rFonts w:ascii="Consolas" w:hAnsi="Consolas"/>
@@ -21779,7 +22017,6 @@
         </w:rPr>
         <w:t>if</w:t>
       </w:r>
-      <w:proofErr w:type="gramEnd"/>
       <w:r>
         <w:rPr>
           <w:rFonts w:ascii="Consolas" w:hAnsi="Consolas"/>
@@ -21811,7 +22048,6 @@
         <w:t xml:space="preserve"> </w:t>
       </w:r>
       <w:proofErr w:type="spellStart"/>
-      <w:proofErr w:type="gramStart"/>
       <w:r>
         <w:rPr>
           <w:rFonts w:ascii="Consolas" w:hAnsi="Consolas"/>
@@ -21834,7 +22070,6 @@
         <w:t>::</w:t>
       </w:r>
       <w:proofErr w:type="spellStart"/>
-      <w:proofErr w:type="gramEnd"/>
       <w:r>
         <w:rPr>
           <w:rFonts w:ascii="Consolas" w:hAnsi="Consolas"/>
@@ -21959,7 +22194,6 @@
         </w:rPr>
         <w:t xml:space="preserve">            </w:t>
       </w:r>
-      <w:proofErr w:type="gramStart"/>
       <w:r>
         <w:rPr>
           <w:rFonts w:ascii="Consolas" w:hAnsi="Consolas"/>
@@ -21980,7 +22214,6 @@
         </w:rPr>
         <w:t>;</w:t>
       </w:r>
-      <w:proofErr w:type="gramEnd"/>
     </w:p>
     <w:p>
       <w:pPr>
@@ -22059,7 +22292,6 @@
         <w:t xml:space="preserve">        </w:t>
       </w:r>
       <w:proofErr w:type="spellStart"/>
-      <w:proofErr w:type="gramStart"/>
       <w:r>
         <w:rPr>
           <w:rFonts w:ascii="Consolas" w:hAnsi="Consolas"/>
@@ -22081,7 +22313,6 @@
         </w:rPr>
         <w:t>(</w:t>
       </w:r>
-      <w:proofErr w:type="gramEnd"/>
       <w:r>
         <w:rPr>
           <w:rFonts w:ascii="Consolas" w:hAnsi="Consolas"/>
@@ -22243,7 +22474,6 @@
         <w:t xml:space="preserve"> </w:t>
       </w:r>
       <w:proofErr w:type="spellStart"/>
-      <w:proofErr w:type="gramStart"/>
       <w:r>
         <w:rPr>
           <w:rFonts w:ascii="Consolas" w:hAnsi="Consolas"/>
@@ -22266,7 +22496,6 @@
         <w:t>::</w:t>
       </w:r>
       <w:proofErr w:type="spellStart"/>
-      <w:proofErr w:type="gramEnd"/>
       <w:r>
         <w:rPr>
           <w:rFonts w:ascii="Consolas" w:hAnsi="Consolas"/>
@@ -22391,7 +22620,6 @@
         <w:t xml:space="preserve">        </w:t>
       </w:r>
       <w:proofErr w:type="spellStart"/>
-      <w:proofErr w:type="gramStart"/>
       <w:r>
         <w:rPr>
           <w:rFonts w:ascii="Consolas" w:hAnsi="Consolas"/>
@@ -22403,7 +22631,6 @@
         <w:t>throw</w:t>
       </w:r>
       <w:proofErr w:type="spellEnd"/>
-      <w:proofErr w:type="gramEnd"/>
       <w:r>
         <w:rPr>
           <w:rFonts w:ascii="Consolas" w:hAnsi="Consolas"/>
@@ -22527,7 +22754,6 @@
         </w:rPr>
         <w:t xml:space="preserve"> </w:t>
       </w:r>
-      <w:proofErr w:type="gramStart"/>
       <w:r>
         <w:rPr>
           <w:rFonts w:ascii="Consolas" w:hAnsi="Consolas"/>
@@ -22548,7 +22774,6 @@
         </w:rPr>
         <w:t>(</w:t>
       </w:r>
-      <w:proofErr w:type="gramEnd"/>
       <w:r>
         <w:rPr>
           <w:rFonts w:ascii="Consolas" w:hAnsi="Consolas"/>
@@ -22750,7 +22975,6 @@
         <w:t xml:space="preserve"> </w:t>
       </w:r>
       <w:proofErr w:type="spellStart"/>
-      <w:proofErr w:type="gramStart"/>
       <w:r>
         <w:rPr>
           <w:rFonts w:ascii="Consolas" w:hAnsi="Consolas"/>
@@ -22772,7 +22996,6 @@
         </w:rPr>
         <w:t>(</w:t>
       </w:r>
-      <w:proofErr w:type="gramEnd"/>
       <w:r>
         <w:rPr>
           <w:rFonts w:ascii="Consolas" w:hAnsi="Consolas"/>
@@ -22849,7 +23072,7 @@
           <w:color w:val="202020"/>
           <w:sz w:val="21"/>
           <w:szCs w:val="21"/>
-          <w:lang w:val="fr-CH" w:eastAsia="it-CH"/>
+          <w:lang w:eastAsia="it-CH"/>
         </w:rPr>
       </w:pPr>
       <w:r>
@@ -22868,7 +23091,7 @@
           <w:color w:val="202020"/>
           <w:sz w:val="21"/>
           <w:szCs w:val="21"/>
-          <w:lang w:val="fr-CH" w:eastAsia="it-CH"/>
+          <w:lang w:eastAsia="it-CH"/>
         </w:rPr>
         <w:t>]),</w:t>
       </w:r>
@@ -22897,7 +23120,7 @@
           <w:color w:val="202020"/>
           <w:sz w:val="21"/>
           <w:szCs w:val="21"/>
-          <w:lang w:val="fr-CH" w:eastAsia="it-CH"/>
+          <w:lang w:eastAsia="it-CH"/>
         </w:rPr>
         <w:t xml:space="preserve">        </w:t>
       </w:r>
@@ -22955,7 +23178,6 @@
         <w:t xml:space="preserve">La funzione </w:t>
       </w:r>
       <w:proofErr w:type="spellStart"/>
-      <w:proofErr w:type="gramStart"/>
       <w:r>
         <w:rPr>
           <w:rFonts w:ascii="Bahnschrift" w:hAnsi="Bahnschrift"/>
@@ -22967,14 +23189,7 @@
         <w:rPr>
           <w:rFonts w:ascii="Bahnschrift" w:hAnsi="Bahnschrift"/>
         </w:rPr>
-        <w:t>(</w:t>
-      </w:r>
-      <w:proofErr w:type="gramEnd"/>
-      <w:r>
-        <w:rPr>
-          <w:rFonts w:ascii="Bahnschrift" w:hAnsi="Bahnschrift"/>
-        </w:rPr>
-        <w:t>) controlla che non sia stato superato il numero massimo di tentativi di login consentiti.</w:t>
+        <w:t>() controlla che non sia stato superato il numero massimo di tentativi di login consentiti.</w:t>
       </w:r>
       <w:r>
         <w:rPr>
@@ -23057,7 +23272,6 @@
           <w:lang w:val="fr-CH" w:eastAsia="it-CH"/>
         </w:rPr>
       </w:pPr>
-      <w:proofErr w:type="gramStart"/>
       <w:r>
         <w:rPr>
           <w:rFonts w:ascii="Consolas" w:hAnsi="Consolas"/>
@@ -23077,7 +23291,6 @@
         <w:t>::</w:t>
       </w:r>
       <w:proofErr w:type="spellStart"/>
-      <w:proofErr w:type="gramEnd"/>
       <w:r>
         <w:rPr>
           <w:rFonts w:ascii="Consolas" w:hAnsi="Consolas"/>
@@ -23182,7 +23395,6 @@
         </w:rPr>
         <w:t xml:space="preserve">    </w:t>
       </w:r>
-      <w:proofErr w:type="gramStart"/>
       <w:r>
         <w:rPr>
           <w:rFonts w:ascii="Consolas" w:hAnsi="Consolas"/>
@@ -23192,7 +23404,6 @@
         </w:rPr>
         <w:t>return</w:t>
       </w:r>
-      <w:proofErr w:type="gramEnd"/>
       <w:r>
         <w:rPr>
           <w:rFonts w:ascii="Consolas" w:hAnsi="Consolas"/>
@@ -23278,7 +23489,6 @@
           <w:lang w:val="fr-CH" w:eastAsia="it-CH"/>
         </w:rPr>
       </w:pPr>
-      <w:proofErr w:type="gramStart"/>
       <w:r>
         <w:rPr>
           <w:rFonts w:ascii="Consolas" w:hAnsi="Consolas"/>
@@ -23295,17 +23505,7 @@
           <w:sz w:val="20"/>
           <w:lang w:val="fr-CH" w:eastAsia="it-CH"/>
         </w:rPr>
-        <w:t>-</w:t>
-      </w:r>
-      <w:proofErr w:type="gramEnd"/>
-      <w:r>
-        <w:rPr>
-          <w:rFonts w:ascii="Consolas" w:hAnsi="Consolas"/>
-          <w:color w:val="573F35"/>
-          <w:sz w:val="20"/>
-          <w:lang w:val="fr-CH" w:eastAsia="it-CH"/>
-        </w:rPr>
-        <w:t>&gt;</w:t>
+        <w:t>-&gt;</w:t>
       </w:r>
       <w:r>
         <w:rPr>
@@ -23504,7 +23704,6 @@
           <w:lang w:val="fr-CH" w:eastAsia="it-CH"/>
         </w:rPr>
       </w:pPr>
-      <w:proofErr w:type="gramStart"/>
       <w:r>
         <w:rPr>
           <w:rFonts w:ascii="Consolas" w:hAnsi="Consolas"/>
@@ -23523,7 +23722,6 @@
         </w:rPr>
         <w:t>::</w:t>
       </w:r>
-      <w:proofErr w:type="gramEnd"/>
       <w:r>
         <w:rPr>
           <w:rFonts w:ascii="Consolas" w:hAnsi="Consolas"/>
@@ -23654,7 +23852,6 @@
         </w:rPr>
         <w:t xml:space="preserve">    </w:t>
       </w:r>
-      <w:proofErr w:type="gramStart"/>
       <w:r>
         <w:rPr>
           <w:rFonts w:ascii="Consolas" w:hAnsi="Consolas"/>
@@ -23674,7 +23871,6 @@
         <w:t>::</w:t>
       </w:r>
       <w:proofErr w:type="spellStart"/>
-      <w:proofErr w:type="gramEnd"/>
       <w:r>
         <w:rPr>
           <w:rFonts w:ascii="Consolas" w:hAnsi="Consolas"/>
@@ -23882,7 +24078,6 @@
         </w:rPr>
         <w:t xml:space="preserve">    </w:t>
       </w:r>
-      <w:proofErr w:type="gramStart"/>
       <w:r>
         <w:rPr>
           <w:rFonts w:ascii="Consolas" w:hAnsi="Consolas"/>
@@ -23901,7 +24096,6 @@
         </w:rPr>
         <w:t>::</w:t>
       </w:r>
-      <w:proofErr w:type="gramEnd"/>
       <w:r>
         <w:rPr>
           <w:rFonts w:ascii="Consolas" w:hAnsi="Consolas"/>
@@ -24089,7 +24283,6 @@
         <w:t xml:space="preserve">    </w:t>
       </w:r>
       <w:proofErr w:type="spellStart"/>
-      <w:proofErr w:type="gramStart"/>
       <w:r>
         <w:rPr>
           <w:rFonts w:ascii="Consolas" w:hAnsi="Consolas"/>
@@ -24109,7 +24302,6 @@
         </w:rPr>
         <w:t>::</w:t>
       </w:r>
-      <w:proofErr w:type="gramEnd"/>
       <w:r>
         <w:rPr>
           <w:rFonts w:ascii="Consolas" w:hAnsi="Consolas"/>
@@ -24335,7 +24527,6 @@
         <w:t xml:space="preserve">    </w:t>
       </w:r>
       <w:proofErr w:type="spellStart"/>
-      <w:proofErr w:type="gramStart"/>
       <w:r>
         <w:rPr>
           <w:rFonts w:ascii="Consolas" w:hAnsi="Consolas"/>
@@ -24356,7 +24547,6 @@
         <w:t>::</w:t>
       </w:r>
       <w:proofErr w:type="spellStart"/>
-      <w:proofErr w:type="gramEnd"/>
       <w:r>
         <w:rPr>
           <w:rFonts w:ascii="Consolas" w:hAnsi="Consolas"/>
@@ -24543,7 +24733,6 @@
         <w:t xml:space="preserve">    </w:t>
       </w:r>
       <w:proofErr w:type="spellStart"/>
-      <w:proofErr w:type="gramStart"/>
       <w:r>
         <w:rPr>
           <w:rFonts w:ascii="Consolas" w:hAnsi="Consolas"/>
@@ -24563,7 +24752,6 @@
         </w:rPr>
         <w:t>::</w:t>
       </w:r>
-      <w:proofErr w:type="gramEnd"/>
       <w:r>
         <w:rPr>
           <w:rFonts w:ascii="Consolas" w:hAnsi="Consolas"/>
@@ -24789,7 +24977,6 @@
         <w:t xml:space="preserve">    </w:t>
       </w:r>
       <w:proofErr w:type="spellStart"/>
-      <w:proofErr w:type="gramStart"/>
       <w:r>
         <w:rPr>
           <w:rFonts w:ascii="Consolas" w:hAnsi="Consolas"/>
@@ -24810,7 +24997,6 @@
         <w:t>::</w:t>
       </w:r>
       <w:proofErr w:type="spellStart"/>
-      <w:proofErr w:type="gramEnd"/>
       <w:r>
         <w:rPr>
           <w:rFonts w:ascii="Consolas" w:hAnsi="Consolas"/>
@@ -24997,7 +25183,6 @@
         <w:t xml:space="preserve">    </w:t>
       </w:r>
       <w:proofErr w:type="spellStart"/>
-      <w:proofErr w:type="gramStart"/>
       <w:r>
         <w:rPr>
           <w:rFonts w:ascii="Consolas" w:hAnsi="Consolas"/>
@@ -25018,7 +25203,6 @@
         <w:t>::</w:t>
       </w:r>
       <w:proofErr w:type="spellStart"/>
-      <w:proofErr w:type="gramEnd"/>
       <w:r>
         <w:rPr>
           <w:rFonts w:ascii="Consolas" w:hAnsi="Consolas"/>
@@ -25205,7 +25389,6 @@
         <w:t xml:space="preserve">    </w:t>
       </w:r>
       <w:proofErr w:type="spellStart"/>
-      <w:proofErr w:type="gramStart"/>
       <w:r>
         <w:rPr>
           <w:rFonts w:ascii="Consolas" w:hAnsi="Consolas"/>
@@ -25226,7 +25409,6 @@
         <w:t>::</w:t>
       </w:r>
       <w:proofErr w:type="spellStart"/>
-      <w:proofErr w:type="gramEnd"/>
       <w:r>
         <w:rPr>
           <w:rFonts w:ascii="Consolas" w:hAnsi="Consolas"/>
@@ -25413,7 +25595,6 @@
         <w:t xml:space="preserve">    </w:t>
       </w:r>
       <w:proofErr w:type="spellStart"/>
-      <w:proofErr w:type="gramStart"/>
       <w:r>
         <w:rPr>
           <w:rFonts w:ascii="Consolas" w:hAnsi="Consolas"/>
@@ -25434,7 +25615,6 @@
         <w:t>::</w:t>
       </w:r>
       <w:proofErr w:type="spellStart"/>
-      <w:proofErr w:type="gramEnd"/>
       <w:r>
         <w:rPr>
           <w:rFonts w:ascii="Consolas" w:hAnsi="Consolas"/>
@@ -25621,7 +25801,6 @@
         <w:t xml:space="preserve">    </w:t>
       </w:r>
       <w:proofErr w:type="spellStart"/>
-      <w:proofErr w:type="gramStart"/>
       <w:r>
         <w:rPr>
           <w:rFonts w:ascii="Consolas" w:hAnsi="Consolas"/>
@@ -25641,7 +25820,6 @@
         </w:rPr>
         <w:t>::</w:t>
       </w:r>
-      <w:proofErr w:type="gramEnd"/>
       <w:r>
         <w:rPr>
           <w:rFonts w:ascii="Consolas" w:hAnsi="Consolas"/>
@@ -25847,7 +26025,6 @@
         <w:t xml:space="preserve">    </w:t>
       </w:r>
       <w:proofErr w:type="spellStart"/>
-      <w:proofErr w:type="gramStart"/>
       <w:r>
         <w:rPr>
           <w:rFonts w:ascii="Consolas" w:hAnsi="Consolas"/>
@@ -25868,7 +26045,6 @@
         <w:t>::</w:t>
       </w:r>
       <w:proofErr w:type="spellStart"/>
-      <w:proofErr w:type="gramEnd"/>
       <w:r>
         <w:rPr>
           <w:rFonts w:ascii="Consolas" w:hAnsi="Consolas"/>
@@ -26381,7 +26557,6 @@
         <w:t>POST /</w:t>
       </w:r>
       <w:proofErr w:type="spellStart"/>
-      <w:proofErr w:type="gramStart"/>
       <w:r>
         <w:rPr>
           <w:rStyle w:val="inline-markdown"/>
@@ -26405,7 +26580,6 @@
         </w:rPr>
         <w:t>:</w:t>
       </w:r>
-      <w:proofErr w:type="gramEnd"/>
       <w:r>
         <w:rPr>
           <w:rFonts w:ascii="Segoe UI" w:hAnsi="Segoe UI" w:cs="Segoe UI"/>
@@ -36735,7 +36909,7 @@
         <w:noProof/>
         <w:sz w:val="20"/>
       </w:rPr>
-      <w:t>24.02.2026</w:t>
+      <w:t>25.02.2026</w:t>
     </w:r>
     <w:r>
       <w:rPr>
@@ -36963,7 +37137,7 @@
         <w:noProof/>
         <w:sz w:val="20"/>
       </w:rPr>
-      <w:t>24.02.2026</w:t>
+      <w:t>25.02.2026</w:t>
     </w:r>
     <w:r>
       <w:rPr>

</xml_diff>